<commit_message>
Bản final: căn cứ văn bản 2025-2030, ảnh bán hàng dựng từ trang thật, giá 220.000đ
Co-Authored-By: Claude Opus 5.5 <noreply@anthropic.com>
Claude-Session: https://claude.ai/code/session_016W4H5FXW9gSiS33Aau8aSB
</commit_message>
<xml_diff>
--- a/01-Sach/Day-cung-AI.docx
+++ b/01-Sach/Day-cung-AI.docx
@@ -1737,6 +1737,2407 @@
           <w:sz w:val="18"/>
           <w:szCs w:val="18"/>
         </w:rPr>
+        <w:t xml:space="preserve">CĂN CỨ BIÊN SOẠN</w:t>
+      </w:r>
+    </w:p>
+    <w:p>
+      <w:pPr>
+        <w:pStyle w:val="Heading1"/>
+        <w:spacing w:after="120"/>
+      </w:pPr>
+      <w:r>
+        <w:rPr>
+          <w:rFonts w:ascii="Cambria" w:cs="Cambria" w:eastAsia="Cambria" w:hAnsi="Cambria"/>
+          <w:color w:val="1B1F24"/>
+          <w:sz w:val="48"/>
+          <w:szCs w:val="48"/>
+        </w:rPr>
+        <w:t xml:space="preserve">Sách dựa trên văn bản nào</w:t>
+      </w:r>
+    </w:p>
+    <w:p>
+      <w:pPr>
+        <w:spacing w:after="240" w:line="300"/>
+      </w:pPr>
+      <w:r>
+        <w:rPr>
+          <w:rFonts w:ascii="Arial" w:cs="Arial" w:eastAsia="Arial" w:hAnsi="Arial"/>
+          <w:i/>
+          <w:iCs/>
+          <w:color w:val="1B1F24"/>
+          <w:sz w:val="22"/>
+          <w:szCs w:val="22"/>
+        </w:rPr>
+        <w:t xml:space="preserve">Các bài được đối chiếu với văn bản pháp luật và hướng dẫn chuyên môn dưới đây, ưu tiên văn bản ban hành 2025-2026 và định hướng đến năm 2030. Dưới tên mỗi bài có dòng CĂN CỨ ghi văn bản liên quan. Sách là tài liệu tham khảo thực hành của tác giả, không phải văn bản của cơ quan nhà nước và không thay thế văn bản gốc. Thầy cô luôn làm theo văn bản hiện hành và hướng dẫn của nhà trường.</w:t>
+      </w:r>
+    </w:p>
+    <w:p>
+      <w:pPr>
+        <w:keepNext/>
+        <w:spacing w:after="80" w:before="200"/>
+      </w:pPr>
+      <w:r>
+        <w:rPr>
+          <w:rFonts w:ascii="Arial" w:cs="Arial" w:eastAsia="Arial" w:hAnsi="Arial"/>
+          <w:color w:val="A67C3D"/>
+          <w:spacing w:val="40"/>
+          <w:sz w:val="16"/>
+          <w:szCs w:val="16"/>
+        </w:rPr>
+        <w:t xml:space="preserve">ĐỊNH HƯỚNG QUỐC GIA ĐẾN NĂM 2030</w:t>
+      </w:r>
+    </w:p>
+    <w:tbl>
+      <w:tblPr>
+        <w:tblW w:type="dxa" w:w="9638"/>
+        <w:tblBorders>
+          <w:top w:val="single" w:color="auto" w:sz="4"/>
+          <w:left w:val="single" w:color="auto" w:sz="4"/>
+          <w:bottom w:val="single" w:color="auto" w:sz="4"/>
+          <w:right w:val="single" w:color="auto" w:sz="4"/>
+          <w:insideH w:val="single" w:color="auto" w:sz="4"/>
+          <w:insideV w:val="single" w:color="auto" w:sz="4"/>
+        </w:tblBorders>
+      </w:tblPr>
+      <w:tblGrid>
+        <w:gridCol w:w="3900"/>
+        <w:gridCol w:w="4338"/>
+        <w:gridCol w:w="1400"/>
+      </w:tblGrid>
+      <w:tr>
+        <w:trPr>
+          <w:tblHeader/>
+        </w:trPr>
+        <w:tc>
+          <w:tcPr>
+            <w:tcW w:type="dxa" w:w="3900"/>
+            <w:tcBorders>
+              <w:top w:val="none" w:color="FFFFFF" w:sz="0"/>
+              <w:left w:val="none" w:color="FFFFFF" w:sz="0"/>
+              <w:bottom w:val="none" w:color="FFFFFF" w:sz="0"/>
+              <w:right w:val="none" w:color="FFFFFF" w:sz="0"/>
+            </w:tcBorders>
+            <w:shd w:fill="1B1F24" w:color="auto" w:val="clear"/>
+            <w:tcMar>
+              <w:top w:type="dxa" w:w="90"/>
+              <w:left w:type="dxa" w:w="160"/>
+              <w:bottom w:type="dxa" w:w="90"/>
+              <w:right w:type="dxa" w:w="160"/>
+            </w:tcMar>
+          </w:tcPr>
+          <w:p>
+            <w:r>
+              <w:rPr>
+                <w:rFonts w:ascii="Arial" w:cs="Arial" w:eastAsia="Arial" w:hAnsi="Arial"/>
+                <w:b/>
+                <w:bCs/>
+                <w:color w:val="FFFFFF"/>
+                <w:sz w:val="20"/>
+                <w:szCs w:val="20"/>
+              </w:rPr>
+              <w:t xml:space="preserve">Văn bản · số hiệu, ngày</w:t>
+            </w:r>
+          </w:p>
+        </w:tc>
+        <w:tc>
+          <w:tcPr>
+            <w:tcW w:type="dxa" w:w="4338"/>
+            <w:tcBorders>
+              <w:top w:val="none" w:color="FFFFFF" w:sz="0"/>
+              <w:left w:val="none" w:color="FFFFFF" w:sz="0"/>
+              <w:bottom w:val="none" w:color="FFFFFF" w:sz="0"/>
+              <w:right w:val="none" w:color="FFFFFF" w:sz="0"/>
+            </w:tcBorders>
+            <w:shd w:fill="1B1F24" w:color="auto" w:val="clear"/>
+            <w:tcMar>
+              <w:top w:type="dxa" w:w="90"/>
+              <w:left w:type="dxa" w:w="160"/>
+              <w:bottom w:type="dxa" w:w="90"/>
+              <w:right w:type="dxa" w:w="160"/>
+            </w:tcMar>
+          </w:tcPr>
+          <w:p>
+            <w:r>
+              <w:rPr>
+                <w:rFonts w:ascii="Arial" w:cs="Arial" w:eastAsia="Arial" w:hAnsi="Arial"/>
+                <w:b/>
+                <w:bCs/>
+                <w:color w:val="FFFFFF"/>
+                <w:sz w:val="20"/>
+                <w:szCs w:val="20"/>
+              </w:rPr>
+              <w:t xml:space="preserve">Sách dựa vào điểm nào</w:t>
+            </w:r>
+          </w:p>
+        </w:tc>
+        <w:tc>
+          <w:tcPr>
+            <w:tcW w:type="dxa" w:w="1400"/>
+            <w:tcBorders>
+              <w:top w:val="none" w:color="FFFFFF" w:sz="0"/>
+              <w:left w:val="none" w:color="FFFFFF" w:sz="0"/>
+              <w:bottom w:val="none" w:color="FFFFFF" w:sz="0"/>
+              <w:right w:val="none" w:color="FFFFFF" w:sz="0"/>
+            </w:tcBorders>
+            <w:shd w:fill="1B1F24" w:color="auto" w:val="clear"/>
+            <w:tcMar>
+              <w:top w:type="dxa" w:w="90"/>
+              <w:left w:type="dxa" w:w="160"/>
+              <w:bottom w:type="dxa" w:w="90"/>
+              <w:right w:type="dxa" w:w="160"/>
+            </w:tcMar>
+          </w:tcPr>
+          <w:p>
+            <w:r>
+              <w:rPr>
+                <w:rFonts w:ascii="Arial" w:cs="Arial" w:eastAsia="Arial" w:hAnsi="Arial"/>
+                <w:b/>
+                <w:bCs/>
+                <w:color w:val="FFFFFF"/>
+                <w:sz w:val="20"/>
+                <w:szCs w:val="20"/>
+              </w:rPr>
+              <w:t xml:space="preserve">Bài</w:t>
+            </w:r>
+          </w:p>
+        </w:tc>
+      </w:tr>
+      <w:tr>
+        <w:tc>
+          <w:tcPr>
+            <w:tcW w:type="dxa" w:w="3900"/>
+            <w:tcBorders>
+              <w:top w:val="none" w:color="FFFFFF" w:sz="0"/>
+              <w:left w:val="none" w:color="FFFFFF" w:sz="0"/>
+              <w:bottom w:val="none" w:color="FFFFFF" w:sz="0"/>
+              <w:right w:val="none" w:color="FFFFFF" w:sz="0"/>
+            </w:tcBorders>
+            <w:shd w:fill="F7F5F0" w:color="auto" w:val="clear"/>
+            <w:tcMar>
+              <w:top w:type="dxa" w:w="90"/>
+              <w:left w:type="dxa" w:w="160"/>
+              <w:bottom w:type="dxa" w:w="90"/>
+              <w:right w:type="dxa" w:w="160"/>
+            </w:tcMar>
+          </w:tcPr>
+          <w:p>
+            <w:r>
+              <w:rPr>
+                <w:rFonts w:ascii="Arial" w:cs="Arial" w:eastAsia="Arial" w:hAnsi="Arial"/>
+                <w:b/>
+                <w:bCs/>
+                <w:color w:val="1B1F24"/>
+                <w:sz w:val="20"/>
+                <w:szCs w:val="20"/>
+              </w:rPr>
+              <w:t xml:space="preserve">Chiến lược quốc gia về trí tuệ nhân tạo đến năm 2030, tầm nhìn 2045</w:t>
+            </w:r>
+            <w:r>
+              <w:rPr>
+                <w:rFonts w:ascii="Arial" w:cs="Arial" w:eastAsia="Arial" w:hAnsi="Arial"/>
+                <w:b w:val="false"/>
+                <w:bCs w:val="false"/>
+                <w:color w:val="1B1F24"/>
+                <w:sz w:val="20"/>
+                <w:szCs w:val="20"/>
+              </w:rPr>
+              <w:t xml:space="preserve">. Quyết định 1671/QĐ-TTg ngày 28/8/2026</w:t>
+            </w:r>
+          </w:p>
+        </w:tc>
+        <w:tc>
+          <w:tcPr>
+            <w:tcW w:type="dxa" w:w="4338"/>
+            <w:tcBorders>
+              <w:top w:val="none" w:color="FFFFFF" w:sz="0"/>
+              <w:left w:val="none" w:color="FFFFFF" w:sz="0"/>
+              <w:bottom w:val="none" w:color="FFFFFF" w:sz="0"/>
+              <w:right w:val="none" w:color="FFFFFF" w:sz="0"/>
+            </w:tcBorders>
+            <w:shd w:fill="F7F5F0" w:color="auto" w:val="clear"/>
+            <w:tcMar>
+              <w:top w:type="dxa" w:w="90"/>
+              <w:left w:type="dxa" w:w="160"/>
+              <w:bottom w:type="dxa" w:w="90"/>
+              <w:right w:type="dxa" w:w="160"/>
+            </w:tcMar>
+          </w:tcPr>
+          <w:p>
+            <w:r>
+              <w:rPr>
+                <w:rFonts w:ascii="Arial" w:cs="Arial" w:eastAsia="Arial" w:hAnsi="Arial"/>
+                <w:b w:val="false"/>
+                <w:bCs w:val="false"/>
+                <w:color w:val="1B1F24"/>
+                <w:sz w:val="20"/>
+                <w:szCs w:val="20"/>
+              </w:rPr>
+              <w:t xml:space="preserve">Chuyển đổi AI quốc gia: AI trở thành năng lực cốt lõi, trong đó có giáo dục.</w:t>
+            </w:r>
+          </w:p>
+        </w:tc>
+        <w:tc>
+          <w:tcPr>
+            <w:tcW w:type="dxa" w:w="1400"/>
+            <w:tcBorders>
+              <w:top w:val="none" w:color="FFFFFF" w:sz="0"/>
+              <w:left w:val="none" w:color="FFFFFF" w:sz="0"/>
+              <w:bottom w:val="none" w:color="FFFFFF" w:sz="0"/>
+              <w:right w:val="none" w:color="FFFFFF" w:sz="0"/>
+            </w:tcBorders>
+            <w:shd w:fill="F7F5F0" w:color="auto" w:val="clear"/>
+            <w:tcMar>
+              <w:top w:type="dxa" w:w="90"/>
+              <w:left w:type="dxa" w:w="160"/>
+              <w:bottom w:type="dxa" w:w="90"/>
+              <w:right w:type="dxa" w:w="160"/>
+            </w:tcMar>
+          </w:tcPr>
+          <w:p>
+            <w:r>
+              <w:rPr>
+                <w:rFonts w:ascii="Arial" w:cs="Arial" w:eastAsia="Arial" w:hAnsi="Arial"/>
+                <w:b w:val="false"/>
+                <w:bCs w:val="false"/>
+                <w:color w:val="1B1F24"/>
+                <w:sz w:val="20"/>
+                <w:szCs w:val="20"/>
+              </w:rPr>
+              <w:t xml:space="preserve">Toàn bộ sách</w:t>
+            </w:r>
+          </w:p>
+        </w:tc>
+      </w:tr>
+      <w:tr>
+        <w:tc>
+          <w:tcPr>
+            <w:tcW w:type="dxa" w:w="3900"/>
+            <w:tcBorders>
+              <w:top w:val="none" w:color="FFFFFF" w:sz="0"/>
+              <w:left w:val="none" w:color="FFFFFF" w:sz="0"/>
+              <w:bottom w:val="none" w:color="FFFFFF" w:sz="0"/>
+              <w:right w:val="none" w:color="FFFFFF" w:sz="0"/>
+            </w:tcBorders>
+            <w:shd w:fill="FFFFFF" w:color="auto" w:val="clear"/>
+            <w:tcMar>
+              <w:top w:type="dxa" w:w="90"/>
+              <w:left w:type="dxa" w:w="160"/>
+              <w:bottom w:type="dxa" w:w="90"/>
+              <w:right w:type="dxa" w:w="160"/>
+            </w:tcMar>
+          </w:tcPr>
+          <w:p>
+            <w:r>
+              <w:rPr>
+                <w:rFonts w:ascii="Arial" w:cs="Arial" w:eastAsia="Arial" w:hAnsi="Arial"/>
+                <w:b/>
+                <w:bCs/>
+                <w:color w:val="1B1F24"/>
+                <w:sz w:val="20"/>
+                <w:szCs w:val="20"/>
+              </w:rPr>
+              <w:t xml:space="preserve">Chương trình phát triển nhân lực trí tuệ nhân tạo đến năm 2030</w:t>
+            </w:r>
+            <w:r>
+              <w:rPr>
+                <w:rFonts w:ascii="Arial" w:cs="Arial" w:eastAsia="Arial" w:hAnsi="Arial"/>
+                <w:b w:val="false"/>
+                <w:bCs w:val="false"/>
+                <w:color w:val="1B1F24"/>
+                <w:sz w:val="20"/>
+                <w:szCs w:val="20"/>
+              </w:rPr>
+              <w:t xml:space="preserve">. Quyết định 1528/QĐ-TTg năm 2026</w:t>
+            </w:r>
+          </w:p>
+        </w:tc>
+        <w:tc>
+          <w:tcPr>
+            <w:tcW w:type="dxa" w:w="4338"/>
+            <w:tcBorders>
+              <w:top w:val="none" w:color="FFFFFF" w:sz="0"/>
+              <w:left w:val="none" w:color="FFFFFF" w:sz="0"/>
+              <w:bottom w:val="none" w:color="FFFFFF" w:sz="0"/>
+              <w:right w:val="none" w:color="FFFFFF" w:sz="0"/>
+            </w:tcBorders>
+            <w:shd w:fill="FFFFFF" w:color="auto" w:val="clear"/>
+            <w:tcMar>
+              <w:top w:type="dxa" w:w="90"/>
+              <w:left w:type="dxa" w:w="160"/>
+              <w:bottom w:type="dxa" w:w="90"/>
+              <w:right w:type="dxa" w:w="160"/>
+            </w:tcMar>
+          </w:tcPr>
+          <w:p>
+            <w:r>
+              <w:rPr>
+                <w:rFonts w:ascii="Arial" w:cs="Arial" w:eastAsia="Arial" w:hAnsi="Arial"/>
+                <w:b w:val="false"/>
+                <w:bCs w:val="false"/>
+                <w:color w:val="1B1F24"/>
+                <w:sz w:val="20"/>
+                <w:szCs w:val="20"/>
+              </w:rPr>
+              <w:t xml:space="preserve">Nâng năng lực AI của người lao động, trong đó có đội ngũ giáo viên.</w:t>
+            </w:r>
+          </w:p>
+        </w:tc>
+        <w:tc>
+          <w:tcPr>
+            <w:tcW w:type="dxa" w:w="1400"/>
+            <w:tcBorders>
+              <w:top w:val="none" w:color="FFFFFF" w:sz="0"/>
+              <w:left w:val="none" w:color="FFFFFF" w:sz="0"/>
+              <w:bottom w:val="none" w:color="FFFFFF" w:sz="0"/>
+              <w:right w:val="none" w:color="FFFFFF" w:sz="0"/>
+            </w:tcBorders>
+            <w:shd w:fill="FFFFFF" w:color="auto" w:val="clear"/>
+            <w:tcMar>
+              <w:top w:type="dxa" w:w="90"/>
+              <w:left w:type="dxa" w:w="160"/>
+              <w:bottom w:type="dxa" w:w="90"/>
+              <w:right w:type="dxa" w:w="160"/>
+            </w:tcMar>
+          </w:tcPr>
+          <w:p>
+            <w:r>
+              <w:rPr>
+                <w:rFonts w:ascii="Arial" w:cs="Arial" w:eastAsia="Arial" w:hAnsi="Arial"/>
+                <w:b w:val="false"/>
+                <w:bCs w:val="false"/>
+                <w:color w:val="1B1F24"/>
+                <w:sz w:val="20"/>
+                <w:szCs w:val="20"/>
+              </w:rPr>
+              <w:t xml:space="preserve">Toàn bộ sách</w:t>
+            </w:r>
+          </w:p>
+        </w:tc>
+      </w:tr>
+      <w:tr>
+        <w:tc>
+          <w:tcPr>
+            <w:tcW w:type="dxa" w:w="3900"/>
+            <w:tcBorders>
+              <w:top w:val="none" w:color="FFFFFF" w:sz="0"/>
+              <w:left w:val="none" w:color="FFFFFF" w:sz="0"/>
+              <w:bottom w:val="none" w:color="FFFFFF" w:sz="0"/>
+              <w:right w:val="none" w:color="FFFFFF" w:sz="0"/>
+            </w:tcBorders>
+            <w:shd w:fill="F7F5F0" w:color="auto" w:val="clear"/>
+            <w:tcMar>
+              <w:top w:type="dxa" w:w="90"/>
+              <w:left w:type="dxa" w:w="160"/>
+              <w:bottom w:type="dxa" w:w="90"/>
+              <w:right w:type="dxa" w:w="160"/>
+            </w:tcMar>
+          </w:tcPr>
+          <w:p>
+            <w:r>
+              <w:rPr>
+                <w:rFonts w:ascii="Arial" w:cs="Arial" w:eastAsia="Arial" w:hAnsi="Arial"/>
+                <w:b/>
+                <w:bCs/>
+                <w:color w:val="1B1F24"/>
+                <w:sz w:val="20"/>
+                <w:szCs w:val="20"/>
+              </w:rPr>
+              <w:t xml:space="preserve">Nghị quyết về đột phá phát triển giáo dục và đào tạo</w:t>
+            </w:r>
+            <w:r>
+              <w:rPr>
+                <w:rFonts w:ascii="Arial" w:cs="Arial" w:eastAsia="Arial" w:hAnsi="Arial"/>
+                <w:b w:val="false"/>
+                <w:bCs w:val="false"/>
+                <w:color w:val="1B1F24"/>
+                <w:sz w:val="20"/>
+                <w:szCs w:val="20"/>
+              </w:rPr>
+              <w:t xml:space="preserve">. Nghị quyết 71-NQ/TW ngày 22/8/2025 của Bộ Chính trị</w:t>
+            </w:r>
+          </w:p>
+        </w:tc>
+        <w:tc>
+          <w:tcPr>
+            <w:tcW w:type="dxa" w:w="4338"/>
+            <w:tcBorders>
+              <w:top w:val="none" w:color="FFFFFF" w:sz="0"/>
+              <w:left w:val="none" w:color="FFFFFF" w:sz="0"/>
+              <w:bottom w:val="none" w:color="FFFFFF" w:sz="0"/>
+              <w:right w:val="none" w:color="FFFFFF" w:sz="0"/>
+            </w:tcBorders>
+            <w:shd w:fill="F7F5F0" w:color="auto" w:val="clear"/>
+            <w:tcMar>
+              <w:top w:type="dxa" w:w="90"/>
+              <w:left w:type="dxa" w:w="160"/>
+              <w:bottom w:type="dxa" w:w="90"/>
+              <w:right w:type="dxa" w:w="160"/>
+            </w:tcMar>
+          </w:tcPr>
+          <w:p>
+            <w:r>
+              <w:rPr>
+                <w:rFonts w:ascii="Arial" w:cs="Arial" w:eastAsia="Arial" w:hAnsi="Arial"/>
+                <w:b w:val="false"/>
+                <w:bCs w:val="false"/>
+                <w:color w:val="1B1F24"/>
+                <w:sz w:val="20"/>
+                <w:szCs w:val="20"/>
+              </w:rPr>
+              <w:t xml:space="preserve">Mục tiêu giáo dục đến 2030, 2035, 2045.</w:t>
+            </w:r>
+          </w:p>
+        </w:tc>
+        <w:tc>
+          <w:tcPr>
+            <w:tcW w:type="dxa" w:w="1400"/>
+            <w:tcBorders>
+              <w:top w:val="none" w:color="FFFFFF" w:sz="0"/>
+              <w:left w:val="none" w:color="FFFFFF" w:sz="0"/>
+              <w:bottom w:val="none" w:color="FFFFFF" w:sz="0"/>
+              <w:right w:val="none" w:color="FFFFFF" w:sz="0"/>
+            </w:tcBorders>
+            <w:shd w:fill="F7F5F0" w:color="auto" w:val="clear"/>
+            <w:tcMar>
+              <w:top w:type="dxa" w:w="90"/>
+              <w:left w:type="dxa" w:w="160"/>
+              <w:bottom w:type="dxa" w:w="90"/>
+              <w:right w:type="dxa" w:w="160"/>
+            </w:tcMar>
+          </w:tcPr>
+          <w:p>
+            <w:r>
+              <w:rPr>
+                <w:rFonts w:ascii="Arial" w:cs="Arial" w:eastAsia="Arial" w:hAnsi="Arial"/>
+                <w:b w:val="false"/>
+                <w:bCs w:val="false"/>
+                <w:color w:val="1B1F24"/>
+                <w:sz w:val="20"/>
+                <w:szCs w:val="20"/>
+              </w:rPr>
+              <w:t xml:space="preserve">Toàn bộ sách</w:t>
+            </w:r>
+          </w:p>
+        </w:tc>
+      </w:tr>
+      <w:tr>
+        <w:tc>
+          <w:tcPr>
+            <w:tcW w:type="dxa" w:w="3900"/>
+            <w:tcBorders>
+              <w:top w:val="none" w:color="FFFFFF" w:sz="0"/>
+              <w:left w:val="none" w:color="FFFFFF" w:sz="0"/>
+              <w:bottom w:val="none" w:color="FFFFFF" w:sz="0"/>
+              <w:right w:val="none" w:color="FFFFFF" w:sz="0"/>
+            </w:tcBorders>
+            <w:shd w:fill="FFFFFF" w:color="auto" w:val="clear"/>
+            <w:tcMar>
+              <w:top w:type="dxa" w:w="90"/>
+              <w:left w:type="dxa" w:w="160"/>
+              <w:bottom w:type="dxa" w:w="90"/>
+              <w:right w:type="dxa" w:w="160"/>
+            </w:tcMar>
+          </w:tcPr>
+          <w:p>
+            <w:r>
+              <w:rPr>
+                <w:rFonts w:ascii="Arial" w:cs="Arial" w:eastAsia="Arial" w:hAnsi="Arial"/>
+                <w:b/>
+                <w:bCs/>
+                <w:color w:val="1B1F24"/>
+                <w:sz w:val="20"/>
+                <w:szCs w:val="20"/>
+              </w:rPr>
+              <w:t xml:space="preserve">Nghị quyết về đột phá phát triển khoa học, công nghệ, đổi mới sáng tạo và chuyển đổi số quốc gia</w:t>
+            </w:r>
+            <w:r>
+              <w:rPr>
+                <w:rFonts w:ascii="Arial" w:cs="Arial" w:eastAsia="Arial" w:hAnsi="Arial"/>
+                <w:b w:val="false"/>
+                <w:bCs w:val="false"/>
+                <w:color w:val="1B1F24"/>
+                <w:sz w:val="20"/>
+                <w:szCs w:val="20"/>
+              </w:rPr>
+              <w:t xml:space="preserve">. Nghị quyết 57-NQ/TW ngày 22/12/2024 của Bộ Chính trị</w:t>
+            </w:r>
+          </w:p>
+        </w:tc>
+        <w:tc>
+          <w:tcPr>
+            <w:tcW w:type="dxa" w:w="4338"/>
+            <w:tcBorders>
+              <w:top w:val="none" w:color="FFFFFF" w:sz="0"/>
+              <w:left w:val="none" w:color="FFFFFF" w:sz="0"/>
+              <w:bottom w:val="none" w:color="FFFFFF" w:sz="0"/>
+              <w:right w:val="none" w:color="FFFFFF" w:sz="0"/>
+            </w:tcBorders>
+            <w:shd w:fill="FFFFFF" w:color="auto" w:val="clear"/>
+            <w:tcMar>
+              <w:top w:type="dxa" w:w="90"/>
+              <w:left w:type="dxa" w:w="160"/>
+              <w:bottom w:type="dxa" w:w="90"/>
+              <w:right w:type="dxa" w:w="160"/>
+            </w:tcMar>
+          </w:tcPr>
+          <w:p>
+            <w:r>
+              <w:rPr>
+                <w:rFonts w:ascii="Arial" w:cs="Arial" w:eastAsia="Arial" w:hAnsi="Arial"/>
+                <w:b w:val="false"/>
+                <w:bCs w:val="false"/>
+                <w:color w:val="1B1F24"/>
+                <w:sz w:val="20"/>
+                <w:szCs w:val="20"/>
+              </w:rPr>
+              <w:t xml:space="preserve">Định hướng chuyển đổi số, ứng dụng công nghệ mới.</w:t>
+            </w:r>
+          </w:p>
+        </w:tc>
+        <w:tc>
+          <w:tcPr>
+            <w:tcW w:type="dxa" w:w="1400"/>
+            <w:tcBorders>
+              <w:top w:val="none" w:color="FFFFFF" w:sz="0"/>
+              <w:left w:val="none" w:color="FFFFFF" w:sz="0"/>
+              <w:bottom w:val="none" w:color="FFFFFF" w:sz="0"/>
+              <w:right w:val="none" w:color="FFFFFF" w:sz="0"/>
+            </w:tcBorders>
+            <w:shd w:fill="FFFFFF" w:color="auto" w:val="clear"/>
+            <w:tcMar>
+              <w:top w:type="dxa" w:w="90"/>
+              <w:left w:type="dxa" w:w="160"/>
+              <w:bottom w:type="dxa" w:w="90"/>
+              <w:right w:type="dxa" w:w="160"/>
+            </w:tcMar>
+          </w:tcPr>
+          <w:p>
+            <w:r>
+              <w:rPr>
+                <w:rFonts w:ascii="Arial" w:cs="Arial" w:eastAsia="Arial" w:hAnsi="Arial"/>
+                <w:b w:val="false"/>
+                <w:bCs w:val="false"/>
+                <w:color w:val="1B1F24"/>
+                <w:sz w:val="20"/>
+                <w:szCs w:val="20"/>
+              </w:rPr>
+              <w:t xml:space="preserve">Toàn bộ sách</w:t>
+            </w:r>
+          </w:p>
+        </w:tc>
+      </w:tr>
+    </w:tbl>
+    <w:p>
+      <w:pPr>
+        <w:spacing w:after="200"/>
+      </w:pPr>
+    </w:p>
+    <w:p>
+      <w:pPr>
+        <w:keepNext/>
+        <w:spacing w:after="80" w:before="200"/>
+      </w:pPr>
+      <w:r>
+        <w:rPr>
+          <w:rFonts w:ascii="Arial" w:cs="Arial" w:eastAsia="Arial" w:hAnsi="Arial"/>
+          <w:color w:val="A67C3D"/>
+          <w:spacing w:val="40"/>
+          <w:sz w:val="16"/>
+          <w:szCs w:val="16"/>
+        </w:rPr>
+        <w:t xml:space="preserve">LUẬT MỚI CÓ HIỆU LỰC NĂM 2026</w:t>
+      </w:r>
+    </w:p>
+    <w:tbl>
+      <w:tblPr>
+        <w:tblW w:type="dxa" w:w="9638"/>
+        <w:tblBorders>
+          <w:top w:val="single" w:color="auto" w:sz="4"/>
+          <w:left w:val="single" w:color="auto" w:sz="4"/>
+          <w:bottom w:val="single" w:color="auto" w:sz="4"/>
+          <w:right w:val="single" w:color="auto" w:sz="4"/>
+          <w:insideH w:val="single" w:color="auto" w:sz="4"/>
+          <w:insideV w:val="single" w:color="auto" w:sz="4"/>
+        </w:tblBorders>
+      </w:tblPr>
+      <w:tblGrid>
+        <w:gridCol w:w="3900"/>
+        <w:gridCol w:w="4338"/>
+        <w:gridCol w:w="1400"/>
+      </w:tblGrid>
+      <w:tr>
+        <w:trPr>
+          <w:tblHeader/>
+        </w:trPr>
+        <w:tc>
+          <w:tcPr>
+            <w:tcW w:type="dxa" w:w="3900"/>
+            <w:tcBorders>
+              <w:top w:val="none" w:color="FFFFFF" w:sz="0"/>
+              <w:left w:val="none" w:color="FFFFFF" w:sz="0"/>
+              <w:bottom w:val="none" w:color="FFFFFF" w:sz="0"/>
+              <w:right w:val="none" w:color="FFFFFF" w:sz="0"/>
+            </w:tcBorders>
+            <w:shd w:fill="1B1F24" w:color="auto" w:val="clear"/>
+            <w:tcMar>
+              <w:top w:type="dxa" w:w="90"/>
+              <w:left w:type="dxa" w:w="160"/>
+              <w:bottom w:type="dxa" w:w="90"/>
+              <w:right w:type="dxa" w:w="160"/>
+            </w:tcMar>
+          </w:tcPr>
+          <w:p>
+            <w:r>
+              <w:rPr>
+                <w:rFonts w:ascii="Arial" w:cs="Arial" w:eastAsia="Arial" w:hAnsi="Arial"/>
+                <w:b/>
+                <w:bCs/>
+                <w:color w:val="FFFFFF"/>
+                <w:sz w:val="20"/>
+                <w:szCs w:val="20"/>
+              </w:rPr>
+              <w:t xml:space="preserve">Văn bản · số hiệu, ngày</w:t>
+            </w:r>
+          </w:p>
+        </w:tc>
+        <w:tc>
+          <w:tcPr>
+            <w:tcW w:type="dxa" w:w="4338"/>
+            <w:tcBorders>
+              <w:top w:val="none" w:color="FFFFFF" w:sz="0"/>
+              <w:left w:val="none" w:color="FFFFFF" w:sz="0"/>
+              <w:bottom w:val="none" w:color="FFFFFF" w:sz="0"/>
+              <w:right w:val="none" w:color="FFFFFF" w:sz="0"/>
+            </w:tcBorders>
+            <w:shd w:fill="1B1F24" w:color="auto" w:val="clear"/>
+            <w:tcMar>
+              <w:top w:type="dxa" w:w="90"/>
+              <w:left w:type="dxa" w:w="160"/>
+              <w:bottom w:type="dxa" w:w="90"/>
+              <w:right w:type="dxa" w:w="160"/>
+            </w:tcMar>
+          </w:tcPr>
+          <w:p>
+            <w:r>
+              <w:rPr>
+                <w:rFonts w:ascii="Arial" w:cs="Arial" w:eastAsia="Arial" w:hAnsi="Arial"/>
+                <w:b/>
+                <w:bCs/>
+                <w:color w:val="FFFFFF"/>
+                <w:sz w:val="20"/>
+                <w:szCs w:val="20"/>
+              </w:rPr>
+              <w:t xml:space="preserve">Sách dựa vào điểm nào</w:t>
+            </w:r>
+          </w:p>
+        </w:tc>
+        <w:tc>
+          <w:tcPr>
+            <w:tcW w:type="dxa" w:w="1400"/>
+            <w:tcBorders>
+              <w:top w:val="none" w:color="FFFFFF" w:sz="0"/>
+              <w:left w:val="none" w:color="FFFFFF" w:sz="0"/>
+              <w:bottom w:val="none" w:color="FFFFFF" w:sz="0"/>
+              <w:right w:val="none" w:color="FFFFFF" w:sz="0"/>
+            </w:tcBorders>
+            <w:shd w:fill="1B1F24" w:color="auto" w:val="clear"/>
+            <w:tcMar>
+              <w:top w:type="dxa" w:w="90"/>
+              <w:left w:type="dxa" w:w="160"/>
+              <w:bottom w:type="dxa" w:w="90"/>
+              <w:right w:type="dxa" w:w="160"/>
+            </w:tcMar>
+          </w:tcPr>
+          <w:p>
+            <w:r>
+              <w:rPr>
+                <w:rFonts w:ascii="Arial" w:cs="Arial" w:eastAsia="Arial" w:hAnsi="Arial"/>
+                <w:b/>
+                <w:bCs/>
+                <w:color w:val="FFFFFF"/>
+                <w:sz w:val="20"/>
+                <w:szCs w:val="20"/>
+              </w:rPr>
+              <w:t xml:space="preserve">Bài</w:t>
+            </w:r>
+          </w:p>
+        </w:tc>
+      </w:tr>
+      <w:tr>
+        <w:tc>
+          <w:tcPr>
+            <w:tcW w:type="dxa" w:w="3900"/>
+            <w:tcBorders>
+              <w:top w:val="none" w:color="FFFFFF" w:sz="0"/>
+              <w:left w:val="none" w:color="FFFFFF" w:sz="0"/>
+              <w:bottom w:val="none" w:color="FFFFFF" w:sz="0"/>
+              <w:right w:val="none" w:color="FFFFFF" w:sz="0"/>
+            </w:tcBorders>
+            <w:shd w:fill="F7F5F0" w:color="auto" w:val="clear"/>
+            <w:tcMar>
+              <w:top w:type="dxa" w:w="90"/>
+              <w:left w:type="dxa" w:w="160"/>
+              <w:bottom w:type="dxa" w:w="90"/>
+              <w:right w:type="dxa" w:w="160"/>
+            </w:tcMar>
+          </w:tcPr>
+          <w:p>
+            <w:r>
+              <w:rPr>
+                <w:rFonts w:ascii="Arial" w:cs="Arial" w:eastAsia="Arial" w:hAnsi="Arial"/>
+                <w:b/>
+                <w:bCs/>
+                <w:color w:val="1B1F24"/>
+                <w:sz w:val="20"/>
+                <w:szCs w:val="20"/>
+              </w:rPr>
+              <w:t xml:space="preserve">Luật Trí tuệ nhân tạo</w:t>
+            </w:r>
+            <w:r>
+              <w:rPr>
+                <w:rFonts w:ascii="Arial" w:cs="Arial" w:eastAsia="Arial" w:hAnsi="Arial"/>
+                <w:b w:val="false"/>
+                <w:bCs w:val="false"/>
+                <w:color w:val="1B1F24"/>
+                <w:sz w:val="20"/>
+                <w:szCs w:val="20"/>
+              </w:rPr>
+              <w:t xml:space="preserve">. Luật số 134/2025/QH15, thông qua 10/12/2025, hiệu lực 01/3/2026</w:t>
+            </w:r>
+          </w:p>
+        </w:tc>
+        <w:tc>
+          <w:tcPr>
+            <w:tcW w:type="dxa" w:w="4338"/>
+            <w:tcBorders>
+              <w:top w:val="none" w:color="FFFFFF" w:sz="0"/>
+              <w:left w:val="none" w:color="FFFFFF" w:sz="0"/>
+              <w:bottom w:val="none" w:color="FFFFFF" w:sz="0"/>
+              <w:right w:val="none" w:color="FFFFFF" w:sz="0"/>
+            </w:tcBorders>
+            <w:shd w:fill="F7F5F0" w:color="auto" w:val="clear"/>
+            <w:tcMar>
+              <w:top w:type="dxa" w:w="90"/>
+              <w:left w:type="dxa" w:w="160"/>
+              <w:bottom w:type="dxa" w:w="90"/>
+              <w:right w:type="dxa" w:w="160"/>
+            </w:tcMar>
+          </w:tcPr>
+          <w:p>
+            <w:r>
+              <w:rPr>
+                <w:rFonts w:ascii="Arial" w:cs="Arial" w:eastAsia="Arial" w:hAnsi="Arial"/>
+                <w:b w:val="false"/>
+                <w:bCs w:val="false"/>
+                <w:color w:val="1B1F24"/>
+                <w:sz w:val="20"/>
+                <w:szCs w:val="20"/>
+              </w:rPr>
+              <w:t xml:space="preserve">AI là công cụ hỗ trợ, con người quyết định cuối cùng. Nội dung do AI tạo ra cần có dấu hiệu nhận biết.</w:t>
+            </w:r>
+          </w:p>
+        </w:tc>
+        <w:tc>
+          <w:tcPr>
+            <w:tcW w:type="dxa" w:w="1400"/>
+            <w:tcBorders>
+              <w:top w:val="none" w:color="FFFFFF" w:sz="0"/>
+              <w:left w:val="none" w:color="FFFFFF" w:sz="0"/>
+              <w:bottom w:val="none" w:color="FFFFFF" w:sz="0"/>
+              <w:right w:val="none" w:color="FFFFFF" w:sz="0"/>
+            </w:tcBorders>
+            <w:shd w:fill="F7F5F0" w:color="auto" w:val="clear"/>
+            <w:tcMar>
+              <w:top w:type="dxa" w:w="90"/>
+              <w:left w:type="dxa" w:w="160"/>
+              <w:bottom w:type="dxa" w:w="90"/>
+              <w:right w:type="dxa" w:w="160"/>
+            </w:tcMar>
+          </w:tcPr>
+          <w:p>
+            <w:r>
+              <w:rPr>
+                <w:rFonts w:ascii="Arial" w:cs="Arial" w:eastAsia="Arial" w:hAnsi="Arial"/>
+                <w:b w:val="false"/>
+                <w:bCs w:val="false"/>
+                <w:color w:val="1B1F24"/>
+                <w:sz w:val="20"/>
+                <w:szCs w:val="20"/>
+              </w:rPr>
+              <w:t xml:space="preserve">A1, D, F</w:t>
+            </w:r>
+          </w:p>
+        </w:tc>
+      </w:tr>
+      <w:tr>
+        <w:tc>
+          <w:tcPr>
+            <w:tcW w:type="dxa" w:w="3900"/>
+            <w:tcBorders>
+              <w:top w:val="none" w:color="FFFFFF" w:sz="0"/>
+              <w:left w:val="none" w:color="FFFFFF" w:sz="0"/>
+              <w:bottom w:val="none" w:color="FFFFFF" w:sz="0"/>
+              <w:right w:val="none" w:color="FFFFFF" w:sz="0"/>
+            </w:tcBorders>
+            <w:shd w:fill="FFFFFF" w:color="auto" w:val="clear"/>
+            <w:tcMar>
+              <w:top w:type="dxa" w:w="90"/>
+              <w:left w:type="dxa" w:w="160"/>
+              <w:bottom w:type="dxa" w:w="90"/>
+              <w:right w:type="dxa" w:w="160"/>
+            </w:tcMar>
+          </w:tcPr>
+          <w:p>
+            <w:r>
+              <w:rPr>
+                <w:rFonts w:ascii="Arial" w:cs="Arial" w:eastAsia="Arial" w:hAnsi="Arial"/>
+                <w:b/>
+                <w:bCs/>
+                <w:color w:val="1B1F24"/>
+                <w:sz w:val="20"/>
+                <w:szCs w:val="20"/>
+              </w:rPr>
+              <w:t xml:space="preserve">Luật Bảo vệ dữ liệu cá nhân</w:t>
+            </w:r>
+            <w:r>
+              <w:rPr>
+                <w:rFonts w:ascii="Arial" w:cs="Arial" w:eastAsia="Arial" w:hAnsi="Arial"/>
+                <w:b w:val="false"/>
+                <w:bCs w:val="false"/>
+                <w:color w:val="1B1F24"/>
+                <w:sz w:val="20"/>
+                <w:szCs w:val="20"/>
+              </w:rPr>
+              <w:t xml:space="preserve">. Luật số 91/2025/QH15, thông qua 26/6/2025, hiệu lực 01/1/2026</w:t>
+            </w:r>
+          </w:p>
+        </w:tc>
+        <w:tc>
+          <w:tcPr>
+            <w:tcW w:type="dxa" w:w="4338"/>
+            <w:tcBorders>
+              <w:top w:val="none" w:color="FFFFFF" w:sz="0"/>
+              <w:left w:val="none" w:color="FFFFFF" w:sz="0"/>
+              <w:bottom w:val="none" w:color="FFFFFF" w:sz="0"/>
+              <w:right w:val="none" w:color="FFFFFF" w:sz="0"/>
+            </w:tcBorders>
+            <w:shd w:fill="FFFFFF" w:color="auto" w:val="clear"/>
+            <w:tcMar>
+              <w:top w:type="dxa" w:w="90"/>
+              <w:left w:type="dxa" w:w="160"/>
+              <w:bottom w:type="dxa" w:w="90"/>
+              <w:right w:type="dxa" w:w="160"/>
+            </w:tcMar>
+          </w:tcPr>
+          <w:p>
+            <w:r>
+              <w:rPr>
+                <w:rFonts w:ascii="Arial" w:cs="Arial" w:eastAsia="Arial" w:hAnsi="Arial"/>
+                <w:b w:val="false"/>
+                <w:bCs w:val="false"/>
+                <w:color w:val="1B1F24"/>
+                <w:sz w:val="20"/>
+                <w:szCs w:val="20"/>
+              </w:rPr>
+              <w:t xml:space="preserve">Không đưa dữ liệu cá nhân của học sinh vào công cụ AI.</w:t>
+            </w:r>
+          </w:p>
+        </w:tc>
+        <w:tc>
+          <w:tcPr>
+            <w:tcW w:type="dxa" w:w="1400"/>
+            <w:tcBorders>
+              <w:top w:val="none" w:color="FFFFFF" w:sz="0"/>
+              <w:left w:val="none" w:color="FFFFFF" w:sz="0"/>
+              <w:bottom w:val="none" w:color="FFFFFF" w:sz="0"/>
+              <w:right w:val="none" w:color="FFFFFF" w:sz="0"/>
+            </w:tcBorders>
+            <w:shd w:fill="FFFFFF" w:color="auto" w:val="clear"/>
+            <w:tcMar>
+              <w:top w:type="dxa" w:w="90"/>
+              <w:left w:type="dxa" w:w="160"/>
+              <w:bottom w:type="dxa" w:w="90"/>
+              <w:right w:type="dxa" w:w="160"/>
+            </w:tcMar>
+          </w:tcPr>
+          <w:p>
+            <w:r>
+              <w:rPr>
+                <w:rFonts w:ascii="Arial" w:cs="Arial" w:eastAsia="Arial" w:hAnsi="Arial"/>
+                <w:b w:val="false"/>
+                <w:bCs w:val="false"/>
+                <w:color w:val="1B1F24"/>
+                <w:sz w:val="20"/>
+                <w:szCs w:val="20"/>
+              </w:rPr>
+              <w:t xml:space="preserve">E4 đến E6, F2</w:t>
+            </w:r>
+          </w:p>
+        </w:tc>
+      </w:tr>
+    </w:tbl>
+    <w:p>
+      <w:pPr>
+        <w:spacing w:after="200"/>
+      </w:pPr>
+    </w:p>
+    <w:p>
+      <w:pPr>
+        <w:keepNext/>
+        <w:spacing w:after="80" w:before="200"/>
+      </w:pPr>
+      <w:r>
+        <w:rPr>
+          <w:rFonts w:ascii="Arial" w:cs="Arial" w:eastAsia="Arial" w:hAnsi="Arial"/>
+          <w:color w:val="A67C3D"/>
+          <w:spacing w:val="40"/>
+          <w:sz w:val="16"/>
+          <w:szCs w:val="16"/>
+        </w:rPr>
+        <w:t xml:space="preserve">HƯỚNG DẪN CỦA NGÀNH GIÁO DỤC 2025-2026</w:t>
+      </w:r>
+    </w:p>
+    <w:tbl>
+      <w:tblPr>
+        <w:tblW w:type="dxa" w:w="9638"/>
+        <w:tblBorders>
+          <w:top w:val="single" w:color="auto" w:sz="4"/>
+          <w:left w:val="single" w:color="auto" w:sz="4"/>
+          <w:bottom w:val="single" w:color="auto" w:sz="4"/>
+          <w:right w:val="single" w:color="auto" w:sz="4"/>
+          <w:insideH w:val="single" w:color="auto" w:sz="4"/>
+          <w:insideV w:val="single" w:color="auto" w:sz="4"/>
+        </w:tblBorders>
+      </w:tblPr>
+      <w:tblGrid>
+        <w:gridCol w:w="3900"/>
+        <w:gridCol w:w="4338"/>
+        <w:gridCol w:w="1400"/>
+      </w:tblGrid>
+      <w:tr>
+        <w:trPr>
+          <w:tblHeader/>
+        </w:trPr>
+        <w:tc>
+          <w:tcPr>
+            <w:tcW w:type="dxa" w:w="3900"/>
+            <w:tcBorders>
+              <w:top w:val="none" w:color="FFFFFF" w:sz="0"/>
+              <w:left w:val="none" w:color="FFFFFF" w:sz="0"/>
+              <w:bottom w:val="none" w:color="FFFFFF" w:sz="0"/>
+              <w:right w:val="none" w:color="FFFFFF" w:sz="0"/>
+            </w:tcBorders>
+            <w:shd w:fill="1B1F24" w:color="auto" w:val="clear"/>
+            <w:tcMar>
+              <w:top w:type="dxa" w:w="90"/>
+              <w:left w:type="dxa" w:w="160"/>
+              <w:bottom w:type="dxa" w:w="90"/>
+              <w:right w:type="dxa" w:w="160"/>
+            </w:tcMar>
+          </w:tcPr>
+          <w:p>
+            <w:r>
+              <w:rPr>
+                <w:rFonts w:ascii="Arial" w:cs="Arial" w:eastAsia="Arial" w:hAnsi="Arial"/>
+                <w:b/>
+                <w:bCs/>
+                <w:color w:val="FFFFFF"/>
+                <w:sz w:val="20"/>
+                <w:szCs w:val="20"/>
+              </w:rPr>
+              <w:t xml:space="preserve">Văn bản · số hiệu, ngày</w:t>
+            </w:r>
+          </w:p>
+        </w:tc>
+        <w:tc>
+          <w:tcPr>
+            <w:tcW w:type="dxa" w:w="4338"/>
+            <w:tcBorders>
+              <w:top w:val="none" w:color="FFFFFF" w:sz="0"/>
+              <w:left w:val="none" w:color="FFFFFF" w:sz="0"/>
+              <w:bottom w:val="none" w:color="FFFFFF" w:sz="0"/>
+              <w:right w:val="none" w:color="FFFFFF" w:sz="0"/>
+            </w:tcBorders>
+            <w:shd w:fill="1B1F24" w:color="auto" w:val="clear"/>
+            <w:tcMar>
+              <w:top w:type="dxa" w:w="90"/>
+              <w:left w:type="dxa" w:w="160"/>
+              <w:bottom w:type="dxa" w:w="90"/>
+              <w:right w:type="dxa" w:w="160"/>
+            </w:tcMar>
+          </w:tcPr>
+          <w:p>
+            <w:r>
+              <w:rPr>
+                <w:rFonts w:ascii="Arial" w:cs="Arial" w:eastAsia="Arial" w:hAnsi="Arial"/>
+                <w:b/>
+                <w:bCs/>
+                <w:color w:val="FFFFFF"/>
+                <w:sz w:val="20"/>
+                <w:szCs w:val="20"/>
+              </w:rPr>
+              <w:t xml:space="preserve">Sách dựa vào điểm nào</w:t>
+            </w:r>
+          </w:p>
+        </w:tc>
+        <w:tc>
+          <w:tcPr>
+            <w:tcW w:type="dxa" w:w="1400"/>
+            <w:tcBorders>
+              <w:top w:val="none" w:color="FFFFFF" w:sz="0"/>
+              <w:left w:val="none" w:color="FFFFFF" w:sz="0"/>
+              <w:bottom w:val="none" w:color="FFFFFF" w:sz="0"/>
+              <w:right w:val="none" w:color="FFFFFF" w:sz="0"/>
+            </w:tcBorders>
+            <w:shd w:fill="1B1F24" w:color="auto" w:val="clear"/>
+            <w:tcMar>
+              <w:top w:type="dxa" w:w="90"/>
+              <w:left w:type="dxa" w:w="160"/>
+              <w:bottom w:type="dxa" w:w="90"/>
+              <w:right w:type="dxa" w:w="160"/>
+            </w:tcMar>
+          </w:tcPr>
+          <w:p>
+            <w:r>
+              <w:rPr>
+                <w:rFonts w:ascii="Arial" w:cs="Arial" w:eastAsia="Arial" w:hAnsi="Arial"/>
+                <w:b/>
+                <w:bCs/>
+                <w:color w:val="FFFFFF"/>
+                <w:sz w:val="20"/>
+                <w:szCs w:val="20"/>
+              </w:rPr>
+              <w:t xml:space="preserve">Bài</w:t>
+            </w:r>
+          </w:p>
+        </w:tc>
+      </w:tr>
+      <w:tr>
+        <w:tc>
+          <w:tcPr>
+            <w:tcW w:type="dxa" w:w="3900"/>
+            <w:tcBorders>
+              <w:top w:val="none" w:color="FFFFFF" w:sz="0"/>
+              <w:left w:val="none" w:color="FFFFFF" w:sz="0"/>
+              <w:bottom w:val="none" w:color="FFFFFF" w:sz="0"/>
+              <w:right w:val="none" w:color="FFFFFF" w:sz="0"/>
+            </w:tcBorders>
+            <w:shd w:fill="F7F5F0" w:color="auto" w:val="clear"/>
+            <w:tcMar>
+              <w:top w:type="dxa" w:w="90"/>
+              <w:left w:type="dxa" w:w="160"/>
+              <w:bottom w:type="dxa" w:w="90"/>
+              <w:right w:type="dxa" w:w="160"/>
+            </w:tcMar>
+          </w:tcPr>
+          <w:p>
+            <w:r>
+              <w:rPr>
+                <w:rFonts w:ascii="Arial" w:cs="Arial" w:eastAsia="Arial" w:hAnsi="Arial"/>
+                <w:b/>
+                <w:bCs/>
+                <w:color w:val="1B1F24"/>
+                <w:sz w:val="20"/>
+                <w:szCs w:val="20"/>
+              </w:rPr>
+              <w:t xml:space="preserve">Khung năng lực số cho người học</w:t>
+            </w:r>
+            <w:r>
+              <w:rPr>
+                <w:rFonts w:ascii="Arial" w:cs="Arial" w:eastAsia="Arial" w:hAnsi="Arial"/>
+                <w:b w:val="false"/>
+                <w:bCs w:val="false"/>
+                <w:color w:val="1B1F24"/>
+                <w:sz w:val="20"/>
+                <w:szCs w:val="20"/>
+              </w:rPr>
+              <w:t xml:space="preserve">. Thông tư 02/2025/TT-BGDĐT ngày 24/01/2025</w:t>
+            </w:r>
+          </w:p>
+        </w:tc>
+        <w:tc>
+          <w:tcPr>
+            <w:tcW w:type="dxa" w:w="4338"/>
+            <w:tcBorders>
+              <w:top w:val="none" w:color="FFFFFF" w:sz="0"/>
+              <w:left w:val="none" w:color="FFFFFF" w:sz="0"/>
+              <w:bottom w:val="none" w:color="FFFFFF" w:sz="0"/>
+              <w:right w:val="none" w:color="FFFFFF" w:sz="0"/>
+            </w:tcBorders>
+            <w:shd w:fill="F7F5F0" w:color="auto" w:val="clear"/>
+            <w:tcMar>
+              <w:top w:type="dxa" w:w="90"/>
+              <w:left w:type="dxa" w:w="160"/>
+              <w:bottom w:type="dxa" w:w="90"/>
+              <w:right w:type="dxa" w:w="160"/>
+            </w:tcMar>
+          </w:tcPr>
+          <w:p>
+            <w:r>
+              <w:rPr>
+                <w:rFonts w:ascii="Arial" w:cs="Arial" w:eastAsia="Arial" w:hAnsi="Arial"/>
+                <w:b w:val="false"/>
+                <w:bCs w:val="false"/>
+                <w:color w:val="1B1F24"/>
+                <w:sz w:val="20"/>
+                <w:szCs w:val="20"/>
+              </w:rPr>
+              <w:t xml:space="preserve">Học sinh dùng công nghệ và AI an toàn, có trách nhiệm.</w:t>
+            </w:r>
+          </w:p>
+        </w:tc>
+        <w:tc>
+          <w:tcPr>
+            <w:tcW w:type="dxa" w:w="1400"/>
+            <w:tcBorders>
+              <w:top w:val="none" w:color="FFFFFF" w:sz="0"/>
+              <w:left w:val="none" w:color="FFFFFF" w:sz="0"/>
+              <w:bottom w:val="none" w:color="FFFFFF" w:sz="0"/>
+              <w:right w:val="none" w:color="FFFFFF" w:sz="0"/>
+            </w:tcBorders>
+            <w:shd w:fill="F7F5F0" w:color="auto" w:val="clear"/>
+            <w:tcMar>
+              <w:top w:type="dxa" w:w="90"/>
+              <w:left w:type="dxa" w:w="160"/>
+              <w:bottom w:type="dxa" w:w="90"/>
+              <w:right w:type="dxa" w:w="160"/>
+            </w:tcMar>
+          </w:tcPr>
+          <w:p>
+            <w:r>
+              <w:rPr>
+                <w:rFonts w:ascii="Arial" w:cs="Arial" w:eastAsia="Arial" w:hAnsi="Arial"/>
+                <w:b w:val="false"/>
+                <w:bCs w:val="false"/>
+                <w:color w:val="1B1F24"/>
+                <w:sz w:val="20"/>
+                <w:szCs w:val="20"/>
+              </w:rPr>
+              <w:t xml:space="preserve">E4, E5, F</w:t>
+            </w:r>
+          </w:p>
+        </w:tc>
+      </w:tr>
+      <w:tr>
+        <w:tc>
+          <w:tcPr>
+            <w:tcW w:type="dxa" w:w="3900"/>
+            <w:tcBorders>
+              <w:top w:val="none" w:color="FFFFFF" w:sz="0"/>
+              <w:left w:val="none" w:color="FFFFFF" w:sz="0"/>
+              <w:bottom w:val="none" w:color="FFFFFF" w:sz="0"/>
+              <w:right w:val="none" w:color="FFFFFF" w:sz="0"/>
+            </w:tcBorders>
+            <w:shd w:fill="FFFFFF" w:color="auto" w:val="clear"/>
+            <w:tcMar>
+              <w:top w:type="dxa" w:w="90"/>
+              <w:left w:type="dxa" w:w="160"/>
+              <w:bottom w:type="dxa" w:w="90"/>
+              <w:right w:type="dxa" w:w="160"/>
+            </w:tcMar>
+          </w:tcPr>
+          <w:p>
+            <w:r>
+              <w:rPr>
+                <w:rFonts w:ascii="Arial" w:cs="Arial" w:eastAsia="Arial" w:hAnsi="Arial"/>
+                <w:b/>
+                <w:bCs/>
+                <w:color w:val="1B1F24"/>
+                <w:sz w:val="20"/>
+                <w:szCs w:val="20"/>
+              </w:rPr>
+              <w:t xml:space="preserve">Triển khai tài liệu Hướng dẫn sử dụng ứng dụng AI trong dạy và học</w:t>
+            </w:r>
+            <w:r>
+              <w:rPr>
+                <w:rFonts w:ascii="Arial" w:cs="Arial" w:eastAsia="Arial" w:hAnsi="Arial"/>
+                <w:b w:val="false"/>
+                <w:bCs w:val="false"/>
+                <w:color w:val="1B1F24"/>
+                <w:sz w:val="20"/>
+                <w:szCs w:val="20"/>
+              </w:rPr>
+              <w:t xml:space="preserve">. Công văn 2250/BGDĐT-GDPT ngày 12/5/2025</w:t>
+            </w:r>
+          </w:p>
+        </w:tc>
+        <w:tc>
+          <w:tcPr>
+            <w:tcW w:type="dxa" w:w="4338"/>
+            <w:tcBorders>
+              <w:top w:val="none" w:color="FFFFFF" w:sz="0"/>
+              <w:left w:val="none" w:color="FFFFFF" w:sz="0"/>
+              <w:bottom w:val="none" w:color="FFFFFF" w:sz="0"/>
+              <w:right w:val="none" w:color="FFFFFF" w:sz="0"/>
+            </w:tcBorders>
+            <w:shd w:fill="FFFFFF" w:color="auto" w:val="clear"/>
+            <w:tcMar>
+              <w:top w:type="dxa" w:w="90"/>
+              <w:left w:type="dxa" w:w="160"/>
+              <w:bottom w:type="dxa" w:w="90"/>
+              <w:right w:type="dxa" w:w="160"/>
+            </w:tcMar>
+          </w:tcPr>
+          <w:p>
+            <w:r>
+              <w:rPr>
+                <w:rFonts w:ascii="Arial" w:cs="Arial" w:eastAsia="Arial" w:hAnsi="Arial"/>
+                <w:b w:val="false"/>
+                <w:bCs w:val="false"/>
+                <w:color w:val="1B1F24"/>
+                <w:sz w:val="20"/>
+                <w:szCs w:val="20"/>
+              </w:rPr>
+              <w:t xml:space="preserve">Dùng AI để nâng hiệu quả, chất lượng dạy và học.</w:t>
+            </w:r>
+          </w:p>
+        </w:tc>
+        <w:tc>
+          <w:tcPr>
+            <w:tcW w:type="dxa" w:w="1400"/>
+            <w:tcBorders>
+              <w:top w:val="none" w:color="FFFFFF" w:sz="0"/>
+              <w:left w:val="none" w:color="FFFFFF" w:sz="0"/>
+              <w:bottom w:val="none" w:color="FFFFFF" w:sz="0"/>
+              <w:right w:val="none" w:color="FFFFFF" w:sz="0"/>
+            </w:tcBorders>
+            <w:shd w:fill="FFFFFF" w:color="auto" w:val="clear"/>
+            <w:tcMar>
+              <w:top w:type="dxa" w:w="90"/>
+              <w:left w:type="dxa" w:w="160"/>
+              <w:bottom w:type="dxa" w:w="90"/>
+              <w:right w:type="dxa" w:w="160"/>
+            </w:tcMar>
+          </w:tcPr>
+          <w:p>
+            <w:r>
+              <w:rPr>
+                <w:rFonts w:ascii="Arial" w:cs="Arial" w:eastAsia="Arial" w:hAnsi="Arial"/>
+                <w:b w:val="false"/>
+                <w:bCs w:val="false"/>
+                <w:color w:val="1B1F24"/>
+                <w:sz w:val="20"/>
+                <w:szCs w:val="20"/>
+              </w:rPr>
+              <w:t xml:space="preserve">Toàn bộ sách</w:t>
+            </w:r>
+          </w:p>
+        </w:tc>
+      </w:tr>
+      <w:tr>
+        <w:tc>
+          <w:tcPr>
+            <w:tcW w:type="dxa" w:w="3900"/>
+            <w:tcBorders>
+              <w:top w:val="none" w:color="FFFFFF" w:sz="0"/>
+              <w:left w:val="none" w:color="FFFFFF" w:sz="0"/>
+              <w:bottom w:val="none" w:color="FFFFFF" w:sz="0"/>
+              <w:right w:val="none" w:color="FFFFFF" w:sz="0"/>
+            </w:tcBorders>
+            <w:shd w:fill="F7F5F0" w:color="auto" w:val="clear"/>
+            <w:tcMar>
+              <w:top w:type="dxa" w:w="90"/>
+              <w:left w:type="dxa" w:w="160"/>
+              <w:bottom w:type="dxa" w:w="90"/>
+              <w:right w:type="dxa" w:w="160"/>
+            </w:tcMar>
+          </w:tcPr>
+          <w:p>
+            <w:r>
+              <w:rPr>
+                <w:rFonts w:ascii="Arial" w:cs="Arial" w:eastAsia="Arial" w:hAnsi="Arial"/>
+                <w:b/>
+                <w:bCs/>
+                <w:color w:val="1B1F24"/>
+                <w:sz w:val="20"/>
+                <w:szCs w:val="20"/>
+              </w:rPr>
+              <w:t xml:space="preserve">Hướng dẫn nhiệm vụ ứng dụng CNTT, chuyển đổi số năm học 2025-2026</w:t>
+            </w:r>
+            <w:r>
+              <w:rPr>
+                <w:rFonts w:ascii="Arial" w:cs="Arial" w:eastAsia="Arial" w:hAnsi="Arial"/>
+                <w:b w:val="false"/>
+                <w:bCs w:val="false"/>
+                <w:color w:val="1B1F24"/>
+                <w:sz w:val="20"/>
+                <w:szCs w:val="20"/>
+              </w:rPr>
+              <w:t xml:space="preserve">. Công văn 5835/BGDĐT-KHCNTT ngày 29/9/2025</w:t>
+            </w:r>
+          </w:p>
+        </w:tc>
+        <w:tc>
+          <w:tcPr>
+            <w:tcW w:type="dxa" w:w="4338"/>
+            <w:tcBorders>
+              <w:top w:val="none" w:color="FFFFFF" w:sz="0"/>
+              <w:left w:val="none" w:color="FFFFFF" w:sz="0"/>
+              <w:bottom w:val="none" w:color="FFFFFF" w:sz="0"/>
+              <w:right w:val="none" w:color="FFFFFF" w:sz="0"/>
+            </w:tcBorders>
+            <w:shd w:fill="F7F5F0" w:color="auto" w:val="clear"/>
+            <w:tcMar>
+              <w:top w:type="dxa" w:w="90"/>
+              <w:left w:type="dxa" w:w="160"/>
+              <w:bottom w:type="dxa" w:w="90"/>
+              <w:right w:type="dxa" w:w="160"/>
+            </w:tcMar>
+          </w:tcPr>
+          <w:p>
+            <w:r>
+              <w:rPr>
+                <w:rFonts w:ascii="Arial" w:cs="Arial" w:eastAsia="Arial" w:hAnsi="Arial"/>
+                <w:b w:val="false"/>
+                <w:bCs w:val="false"/>
+                <w:color w:val="1B1F24"/>
+                <w:sz w:val="20"/>
+                <w:szCs w:val="20"/>
+              </w:rPr>
+              <w:t xml:space="preserve">Bồi dưỡng giáo viên về ứng dụng AI, STEM/STEAM.</w:t>
+            </w:r>
+          </w:p>
+        </w:tc>
+        <w:tc>
+          <w:tcPr>
+            <w:tcW w:type="dxa" w:w="1400"/>
+            <w:tcBorders>
+              <w:top w:val="none" w:color="FFFFFF" w:sz="0"/>
+              <w:left w:val="none" w:color="FFFFFF" w:sz="0"/>
+              <w:bottom w:val="none" w:color="FFFFFF" w:sz="0"/>
+              <w:right w:val="none" w:color="FFFFFF" w:sz="0"/>
+            </w:tcBorders>
+            <w:shd w:fill="F7F5F0" w:color="auto" w:val="clear"/>
+            <w:tcMar>
+              <w:top w:type="dxa" w:w="90"/>
+              <w:left w:type="dxa" w:w="160"/>
+              <w:bottom w:type="dxa" w:w="90"/>
+              <w:right w:type="dxa" w:w="160"/>
+            </w:tcMar>
+          </w:tcPr>
+          <w:p>
+            <w:r>
+              <w:rPr>
+                <w:rFonts w:ascii="Arial" w:cs="Arial" w:eastAsia="Arial" w:hAnsi="Arial"/>
+                <w:b w:val="false"/>
+                <w:bCs w:val="false"/>
+                <w:color w:val="1B1F24"/>
+                <w:sz w:val="20"/>
+                <w:szCs w:val="20"/>
+              </w:rPr>
+              <w:t xml:space="preserve">B7, C2, E</w:t>
+            </w:r>
+          </w:p>
+        </w:tc>
+      </w:tr>
+      <w:tr>
+        <w:tc>
+          <w:tcPr>
+            <w:tcW w:type="dxa" w:w="3900"/>
+            <w:tcBorders>
+              <w:top w:val="none" w:color="FFFFFF" w:sz="0"/>
+              <w:left w:val="none" w:color="FFFFFF" w:sz="0"/>
+              <w:bottom w:val="none" w:color="FFFFFF" w:sz="0"/>
+              <w:right w:val="none" w:color="FFFFFF" w:sz="0"/>
+            </w:tcBorders>
+            <w:shd w:fill="FFFFFF" w:color="auto" w:val="clear"/>
+            <w:tcMar>
+              <w:top w:type="dxa" w:w="90"/>
+              <w:left w:type="dxa" w:w="160"/>
+              <w:bottom w:type="dxa" w:w="90"/>
+              <w:right w:type="dxa" w:w="160"/>
+            </w:tcMar>
+          </w:tcPr>
+          <w:p>
+            <w:r>
+              <w:rPr>
+                <w:rFonts w:ascii="Arial" w:cs="Arial" w:eastAsia="Arial" w:hAnsi="Arial"/>
+                <w:b/>
+                <w:bCs/>
+                <w:color w:val="1B1F24"/>
+                <w:sz w:val="20"/>
+                <w:szCs w:val="20"/>
+              </w:rPr>
+              <w:t xml:space="preserve">Khung nội dung thí điểm giáo dục AI cho học sinh phổ thông</w:t>
+            </w:r>
+            <w:r>
+              <w:rPr>
+                <w:rFonts w:ascii="Arial" w:cs="Arial" w:eastAsia="Arial" w:hAnsi="Arial"/>
+                <w:b w:val="false"/>
+                <w:bCs w:val="false"/>
+                <w:color w:val="1B1F24"/>
+                <w:sz w:val="20"/>
+                <w:szCs w:val="20"/>
+              </w:rPr>
+              <w:t xml:space="preserve">. Quyết định 3439/QĐ-BGDĐT ngày 15/12/2025</w:t>
+            </w:r>
+          </w:p>
+        </w:tc>
+        <w:tc>
+          <w:tcPr>
+            <w:tcW w:type="dxa" w:w="4338"/>
+            <w:tcBorders>
+              <w:top w:val="none" w:color="FFFFFF" w:sz="0"/>
+              <w:left w:val="none" w:color="FFFFFF" w:sz="0"/>
+              <w:bottom w:val="none" w:color="FFFFFF" w:sz="0"/>
+              <w:right w:val="none" w:color="FFFFFF" w:sz="0"/>
+            </w:tcBorders>
+            <w:shd w:fill="FFFFFF" w:color="auto" w:val="clear"/>
+            <w:tcMar>
+              <w:top w:type="dxa" w:w="90"/>
+              <w:left w:type="dxa" w:w="160"/>
+              <w:bottom w:type="dxa" w:w="90"/>
+              <w:right w:type="dxa" w:w="160"/>
+            </w:tcMar>
+          </w:tcPr>
+          <w:p>
+            <w:r>
+              <w:rPr>
+                <w:rFonts w:ascii="Arial" w:cs="Arial" w:eastAsia="Arial" w:hAnsi="Arial"/>
+                <w:b w:val="false"/>
+                <w:bCs w:val="false"/>
+                <w:color w:val="1B1F24"/>
+                <w:sz w:val="20"/>
+                <w:szCs w:val="20"/>
+              </w:rPr>
+              <w:t xml:space="preserve">Bốn mạch: tư duy lấy con người làm trung tâm, đạo đức AI, kỹ thuật và ứng dụng AI, thiết kế hệ thống AI.</w:t>
+            </w:r>
+          </w:p>
+        </w:tc>
+        <w:tc>
+          <w:tcPr>
+            <w:tcW w:type="dxa" w:w="1400"/>
+            <w:tcBorders>
+              <w:top w:val="none" w:color="FFFFFF" w:sz="0"/>
+              <w:left w:val="none" w:color="FFFFFF" w:sz="0"/>
+              <w:bottom w:val="none" w:color="FFFFFF" w:sz="0"/>
+              <w:right w:val="none" w:color="FFFFFF" w:sz="0"/>
+            </w:tcBorders>
+            <w:shd w:fill="FFFFFF" w:color="auto" w:val="clear"/>
+            <w:tcMar>
+              <w:top w:type="dxa" w:w="90"/>
+              <w:left w:type="dxa" w:w="160"/>
+              <w:bottom w:type="dxa" w:w="90"/>
+              <w:right w:type="dxa" w:w="160"/>
+            </w:tcMar>
+          </w:tcPr>
+          <w:p>
+            <w:r>
+              <w:rPr>
+                <w:rFonts w:ascii="Arial" w:cs="Arial" w:eastAsia="Arial" w:hAnsi="Arial"/>
+                <w:b w:val="false"/>
+                <w:bCs w:val="false"/>
+                <w:color w:val="1B1F24"/>
+                <w:sz w:val="20"/>
+                <w:szCs w:val="20"/>
+              </w:rPr>
+              <w:t xml:space="preserve">F1</w:t>
+            </w:r>
+          </w:p>
+        </w:tc>
+      </w:tr>
+      <w:tr>
+        <w:tc>
+          <w:tcPr>
+            <w:tcW w:type="dxa" w:w="3900"/>
+            <w:tcBorders>
+              <w:top w:val="none" w:color="FFFFFF" w:sz="0"/>
+              <w:left w:val="none" w:color="FFFFFF" w:sz="0"/>
+              <w:bottom w:val="none" w:color="FFFFFF" w:sz="0"/>
+              <w:right w:val="none" w:color="FFFFFF" w:sz="0"/>
+            </w:tcBorders>
+            <w:shd w:fill="F7F5F0" w:color="auto" w:val="clear"/>
+            <w:tcMar>
+              <w:top w:type="dxa" w:w="90"/>
+              <w:left w:type="dxa" w:w="160"/>
+              <w:bottom w:type="dxa" w:w="90"/>
+              <w:right w:type="dxa" w:w="160"/>
+            </w:tcMar>
+          </w:tcPr>
+          <w:p>
+            <w:r>
+              <w:rPr>
+                <w:rFonts w:ascii="Arial" w:cs="Arial" w:eastAsia="Arial" w:hAnsi="Arial"/>
+                <w:b/>
+                <w:bCs/>
+                <w:color w:val="1B1F24"/>
+                <w:sz w:val="20"/>
+                <w:szCs w:val="20"/>
+              </w:rPr>
+              <w:t xml:space="preserve">Khung năng lực AI cho giáo viên (UNESCO)</w:t>
+            </w:r>
+            <w:r>
+              <w:rPr>
+                <w:rFonts w:ascii="Arial" w:cs="Arial" w:eastAsia="Arial" w:hAnsi="Arial"/>
+                <w:b w:val="false"/>
+                <w:bCs w:val="false"/>
+                <w:color w:val="1B1F24"/>
+                <w:sz w:val="20"/>
+                <w:szCs w:val="20"/>
+              </w:rPr>
+              <w:t xml:space="preserve">. UNESCO, 2024</w:t>
+            </w:r>
+          </w:p>
+        </w:tc>
+        <w:tc>
+          <w:tcPr>
+            <w:tcW w:type="dxa" w:w="4338"/>
+            <w:tcBorders>
+              <w:top w:val="none" w:color="FFFFFF" w:sz="0"/>
+              <w:left w:val="none" w:color="FFFFFF" w:sz="0"/>
+              <w:bottom w:val="none" w:color="FFFFFF" w:sz="0"/>
+              <w:right w:val="none" w:color="FFFFFF" w:sz="0"/>
+            </w:tcBorders>
+            <w:shd w:fill="F7F5F0" w:color="auto" w:val="clear"/>
+            <w:tcMar>
+              <w:top w:type="dxa" w:w="90"/>
+              <w:left w:type="dxa" w:w="160"/>
+              <w:bottom w:type="dxa" w:w="90"/>
+              <w:right w:type="dxa" w:w="160"/>
+            </w:tcMar>
+          </w:tcPr>
+          <w:p>
+            <w:r>
+              <w:rPr>
+                <w:rFonts w:ascii="Arial" w:cs="Arial" w:eastAsia="Arial" w:hAnsi="Arial"/>
+                <w:b w:val="false"/>
+                <w:bCs w:val="false"/>
+                <w:color w:val="1B1F24"/>
+                <w:sz w:val="20"/>
+                <w:szCs w:val="20"/>
+              </w:rPr>
+              <w:t xml:space="preserve">5 lĩnh vực, 3 cấp độ năng lực AI của giáo viên.</w:t>
+            </w:r>
+          </w:p>
+        </w:tc>
+        <w:tc>
+          <w:tcPr>
+            <w:tcW w:type="dxa" w:w="1400"/>
+            <w:tcBorders>
+              <w:top w:val="none" w:color="FFFFFF" w:sz="0"/>
+              <w:left w:val="none" w:color="FFFFFF" w:sz="0"/>
+              <w:bottom w:val="none" w:color="FFFFFF" w:sz="0"/>
+              <w:right w:val="none" w:color="FFFFFF" w:sz="0"/>
+            </w:tcBorders>
+            <w:shd w:fill="F7F5F0" w:color="auto" w:val="clear"/>
+            <w:tcMar>
+              <w:top w:type="dxa" w:w="90"/>
+              <w:left w:type="dxa" w:w="160"/>
+              <w:bottom w:type="dxa" w:w="90"/>
+              <w:right w:type="dxa" w:w="160"/>
+            </w:tcMar>
+          </w:tcPr>
+          <w:p>
+            <w:r>
+              <w:rPr>
+                <w:rFonts w:ascii="Arial" w:cs="Arial" w:eastAsia="Arial" w:hAnsi="Arial"/>
+                <w:b w:val="false"/>
+                <w:bCs w:val="false"/>
+                <w:color w:val="1B1F24"/>
+                <w:sz w:val="20"/>
+                <w:szCs w:val="20"/>
+              </w:rPr>
+              <w:t xml:space="preserve">F1</w:t>
+            </w:r>
+          </w:p>
+        </w:tc>
+      </w:tr>
+    </w:tbl>
+    <w:p>
+      <w:pPr>
+        <w:spacing w:after="200"/>
+      </w:pPr>
+    </w:p>
+    <w:p>
+      <w:pPr>
+        <w:keepNext/>
+        <w:spacing w:after="80" w:before="200"/>
+      </w:pPr>
+      <w:r>
+        <w:rPr>
+          <w:rFonts w:ascii="Arial" w:cs="Arial" w:eastAsia="Arial" w:hAnsi="Arial"/>
+          <w:color w:val="A67C3D"/>
+          <w:spacing w:val="40"/>
+          <w:sz w:val="16"/>
+          <w:szCs w:val="16"/>
+        </w:rPr>
+        <w:t xml:space="preserve">VĂN BẢN CHUYÊN MÔN ĐANG ÁP DỤNG KHI SOẠN BÀI, RA ĐỀ</w:t>
+      </w:r>
+    </w:p>
+    <w:tbl>
+      <w:tblPr>
+        <w:tblW w:type="dxa" w:w="9638"/>
+        <w:tblBorders>
+          <w:top w:val="single" w:color="auto" w:sz="4"/>
+          <w:left w:val="single" w:color="auto" w:sz="4"/>
+          <w:bottom w:val="single" w:color="auto" w:sz="4"/>
+          <w:right w:val="single" w:color="auto" w:sz="4"/>
+          <w:insideH w:val="single" w:color="auto" w:sz="4"/>
+          <w:insideV w:val="single" w:color="auto" w:sz="4"/>
+        </w:tblBorders>
+      </w:tblPr>
+      <w:tblGrid>
+        <w:gridCol w:w="3900"/>
+        <w:gridCol w:w="4338"/>
+        <w:gridCol w:w="1400"/>
+      </w:tblGrid>
+      <w:tr>
+        <w:trPr>
+          <w:tblHeader/>
+        </w:trPr>
+        <w:tc>
+          <w:tcPr>
+            <w:tcW w:type="dxa" w:w="3900"/>
+            <w:tcBorders>
+              <w:top w:val="none" w:color="FFFFFF" w:sz="0"/>
+              <w:left w:val="none" w:color="FFFFFF" w:sz="0"/>
+              <w:bottom w:val="none" w:color="FFFFFF" w:sz="0"/>
+              <w:right w:val="none" w:color="FFFFFF" w:sz="0"/>
+            </w:tcBorders>
+            <w:shd w:fill="1B1F24" w:color="auto" w:val="clear"/>
+            <w:tcMar>
+              <w:top w:type="dxa" w:w="90"/>
+              <w:left w:type="dxa" w:w="160"/>
+              <w:bottom w:type="dxa" w:w="90"/>
+              <w:right w:type="dxa" w:w="160"/>
+            </w:tcMar>
+          </w:tcPr>
+          <w:p>
+            <w:r>
+              <w:rPr>
+                <w:rFonts w:ascii="Arial" w:cs="Arial" w:eastAsia="Arial" w:hAnsi="Arial"/>
+                <w:b/>
+                <w:bCs/>
+                <w:color w:val="FFFFFF"/>
+                <w:sz w:val="20"/>
+                <w:szCs w:val="20"/>
+              </w:rPr>
+              <w:t xml:space="preserve">Văn bản · số hiệu, ngày</w:t>
+            </w:r>
+          </w:p>
+        </w:tc>
+        <w:tc>
+          <w:tcPr>
+            <w:tcW w:type="dxa" w:w="4338"/>
+            <w:tcBorders>
+              <w:top w:val="none" w:color="FFFFFF" w:sz="0"/>
+              <w:left w:val="none" w:color="FFFFFF" w:sz="0"/>
+              <w:bottom w:val="none" w:color="FFFFFF" w:sz="0"/>
+              <w:right w:val="none" w:color="FFFFFF" w:sz="0"/>
+            </w:tcBorders>
+            <w:shd w:fill="1B1F24" w:color="auto" w:val="clear"/>
+            <w:tcMar>
+              <w:top w:type="dxa" w:w="90"/>
+              <w:left w:type="dxa" w:w="160"/>
+              <w:bottom w:type="dxa" w:w="90"/>
+              <w:right w:type="dxa" w:w="160"/>
+            </w:tcMar>
+          </w:tcPr>
+          <w:p>
+            <w:r>
+              <w:rPr>
+                <w:rFonts w:ascii="Arial" w:cs="Arial" w:eastAsia="Arial" w:hAnsi="Arial"/>
+                <w:b/>
+                <w:bCs/>
+                <w:color w:val="FFFFFF"/>
+                <w:sz w:val="20"/>
+                <w:szCs w:val="20"/>
+              </w:rPr>
+              <w:t xml:space="preserve">Sách dựa vào điểm nào</w:t>
+            </w:r>
+          </w:p>
+        </w:tc>
+        <w:tc>
+          <w:tcPr>
+            <w:tcW w:type="dxa" w:w="1400"/>
+            <w:tcBorders>
+              <w:top w:val="none" w:color="FFFFFF" w:sz="0"/>
+              <w:left w:val="none" w:color="FFFFFF" w:sz="0"/>
+              <w:bottom w:val="none" w:color="FFFFFF" w:sz="0"/>
+              <w:right w:val="none" w:color="FFFFFF" w:sz="0"/>
+            </w:tcBorders>
+            <w:shd w:fill="1B1F24" w:color="auto" w:val="clear"/>
+            <w:tcMar>
+              <w:top w:type="dxa" w:w="90"/>
+              <w:left w:type="dxa" w:w="160"/>
+              <w:bottom w:type="dxa" w:w="90"/>
+              <w:right w:type="dxa" w:w="160"/>
+            </w:tcMar>
+          </w:tcPr>
+          <w:p>
+            <w:r>
+              <w:rPr>
+                <w:rFonts w:ascii="Arial" w:cs="Arial" w:eastAsia="Arial" w:hAnsi="Arial"/>
+                <w:b/>
+                <w:bCs/>
+                <w:color w:val="FFFFFF"/>
+                <w:sz w:val="20"/>
+                <w:szCs w:val="20"/>
+              </w:rPr>
+              <w:t xml:space="preserve">Bài</w:t>
+            </w:r>
+          </w:p>
+        </w:tc>
+      </w:tr>
+      <w:tr>
+        <w:tc>
+          <w:tcPr>
+            <w:tcW w:type="dxa" w:w="3900"/>
+            <w:tcBorders>
+              <w:top w:val="none" w:color="FFFFFF" w:sz="0"/>
+              <w:left w:val="none" w:color="FFFFFF" w:sz="0"/>
+              <w:bottom w:val="none" w:color="FFFFFF" w:sz="0"/>
+              <w:right w:val="none" w:color="FFFFFF" w:sz="0"/>
+            </w:tcBorders>
+            <w:shd w:fill="F7F5F0" w:color="auto" w:val="clear"/>
+            <w:tcMar>
+              <w:top w:type="dxa" w:w="90"/>
+              <w:left w:type="dxa" w:w="160"/>
+              <w:bottom w:type="dxa" w:w="90"/>
+              <w:right w:type="dxa" w:w="160"/>
+            </w:tcMar>
+          </w:tcPr>
+          <w:p>
+            <w:r>
+              <w:rPr>
+                <w:rFonts w:ascii="Arial" w:cs="Arial" w:eastAsia="Arial" w:hAnsi="Arial"/>
+                <w:b/>
+                <w:bCs/>
+                <w:color w:val="1B1F24"/>
+                <w:sz w:val="20"/>
+                <w:szCs w:val="20"/>
+              </w:rPr>
+              <w:t xml:space="preserve">Chương trình giáo dục phổ thông</w:t>
+            </w:r>
+            <w:r>
+              <w:rPr>
+                <w:rFonts w:ascii="Arial" w:cs="Arial" w:eastAsia="Arial" w:hAnsi="Arial"/>
+                <w:b w:val="false"/>
+                <w:bCs w:val="false"/>
+                <w:color w:val="1B1F24"/>
+                <w:sz w:val="20"/>
+                <w:szCs w:val="20"/>
+              </w:rPr>
+              <w:t xml:space="preserve">. Thông tư 32/2018/TT-BGDĐT (chương trình đang áp dụng)</w:t>
+            </w:r>
+          </w:p>
+        </w:tc>
+        <w:tc>
+          <w:tcPr>
+            <w:tcW w:type="dxa" w:w="4338"/>
+            <w:tcBorders>
+              <w:top w:val="none" w:color="FFFFFF" w:sz="0"/>
+              <w:left w:val="none" w:color="FFFFFF" w:sz="0"/>
+              <w:bottom w:val="none" w:color="FFFFFF" w:sz="0"/>
+              <w:right w:val="none" w:color="FFFFFF" w:sz="0"/>
+            </w:tcBorders>
+            <w:shd w:fill="F7F5F0" w:color="auto" w:val="clear"/>
+            <w:tcMar>
+              <w:top w:type="dxa" w:w="90"/>
+              <w:left w:type="dxa" w:w="160"/>
+              <w:bottom w:type="dxa" w:w="90"/>
+              <w:right w:type="dxa" w:w="160"/>
+            </w:tcMar>
+          </w:tcPr>
+          <w:p>
+            <w:r>
+              <w:rPr>
+                <w:rFonts w:ascii="Arial" w:cs="Arial" w:eastAsia="Arial" w:hAnsi="Arial"/>
+                <w:b w:val="false"/>
+                <w:bCs w:val="false"/>
+                <w:color w:val="1B1F24"/>
+                <w:sz w:val="20"/>
+                <w:szCs w:val="20"/>
+              </w:rPr>
+              <w:t xml:space="preserve">Nội dung, yêu cầu cần đạt khi soạn bài và ra đề.</w:t>
+            </w:r>
+          </w:p>
+        </w:tc>
+        <w:tc>
+          <w:tcPr>
+            <w:tcW w:type="dxa" w:w="1400"/>
+            <w:tcBorders>
+              <w:top w:val="none" w:color="FFFFFF" w:sz="0"/>
+              <w:left w:val="none" w:color="FFFFFF" w:sz="0"/>
+              <w:bottom w:val="none" w:color="FFFFFF" w:sz="0"/>
+              <w:right w:val="none" w:color="FFFFFF" w:sz="0"/>
+            </w:tcBorders>
+            <w:shd w:fill="F7F5F0" w:color="auto" w:val="clear"/>
+            <w:tcMar>
+              <w:top w:type="dxa" w:w="90"/>
+              <w:left w:type="dxa" w:w="160"/>
+              <w:bottom w:type="dxa" w:w="90"/>
+              <w:right w:type="dxa" w:w="160"/>
+            </w:tcMar>
+          </w:tcPr>
+          <w:p>
+            <w:r>
+              <w:rPr>
+                <w:rFonts w:ascii="Arial" w:cs="Arial" w:eastAsia="Arial" w:hAnsi="Arial"/>
+                <w:b w:val="false"/>
+                <w:bCs w:val="false"/>
+                <w:color w:val="1B1F24"/>
+                <w:sz w:val="20"/>
+                <w:szCs w:val="20"/>
+              </w:rPr>
+              <w:t xml:space="preserve">B, C</w:t>
+            </w:r>
+          </w:p>
+        </w:tc>
+      </w:tr>
+      <w:tr>
+        <w:tc>
+          <w:tcPr>
+            <w:tcW w:type="dxa" w:w="3900"/>
+            <w:tcBorders>
+              <w:top w:val="none" w:color="FFFFFF" w:sz="0"/>
+              <w:left w:val="none" w:color="FFFFFF" w:sz="0"/>
+              <w:bottom w:val="none" w:color="FFFFFF" w:sz="0"/>
+              <w:right w:val="none" w:color="FFFFFF" w:sz="0"/>
+            </w:tcBorders>
+            <w:shd w:fill="FFFFFF" w:color="auto" w:val="clear"/>
+            <w:tcMar>
+              <w:top w:type="dxa" w:w="90"/>
+              <w:left w:type="dxa" w:w="160"/>
+              <w:bottom w:type="dxa" w:w="90"/>
+              <w:right w:type="dxa" w:w="160"/>
+            </w:tcMar>
+          </w:tcPr>
+          <w:p>
+            <w:r>
+              <w:rPr>
+                <w:rFonts w:ascii="Arial" w:cs="Arial" w:eastAsia="Arial" w:hAnsi="Arial"/>
+                <w:b/>
+                <w:bCs/>
+                <w:color w:val="1B1F24"/>
+                <w:sz w:val="20"/>
+                <w:szCs w:val="20"/>
+              </w:rPr>
+              <w:t xml:space="preserve">Chương trình giáo dục mầm non</w:t>
+            </w:r>
+            <w:r>
+              <w:rPr>
+                <w:rFonts w:ascii="Arial" w:cs="Arial" w:eastAsia="Arial" w:hAnsi="Arial"/>
+                <w:b w:val="false"/>
+                <w:bCs w:val="false"/>
+                <w:color w:val="1B1F24"/>
+                <w:sz w:val="20"/>
+                <w:szCs w:val="20"/>
+              </w:rPr>
+              <w:t xml:space="preserve">. Văn bản hợp nhất 01/VBHN-BGDĐT ngày 13/4/2021</w:t>
+            </w:r>
+          </w:p>
+        </w:tc>
+        <w:tc>
+          <w:tcPr>
+            <w:tcW w:type="dxa" w:w="4338"/>
+            <w:tcBorders>
+              <w:top w:val="none" w:color="FFFFFF" w:sz="0"/>
+              <w:left w:val="none" w:color="FFFFFF" w:sz="0"/>
+              <w:bottom w:val="none" w:color="FFFFFF" w:sz="0"/>
+              <w:right w:val="none" w:color="FFFFFF" w:sz="0"/>
+            </w:tcBorders>
+            <w:shd w:fill="FFFFFF" w:color="auto" w:val="clear"/>
+            <w:tcMar>
+              <w:top w:type="dxa" w:w="90"/>
+              <w:left w:type="dxa" w:w="160"/>
+              <w:bottom w:type="dxa" w:w="90"/>
+              <w:right w:type="dxa" w:w="160"/>
+            </w:tcMar>
+          </w:tcPr>
+          <w:p>
+            <w:r>
+              <w:rPr>
+                <w:rFonts w:ascii="Arial" w:cs="Arial" w:eastAsia="Arial" w:hAnsi="Arial"/>
+                <w:b w:val="false"/>
+                <w:bCs w:val="false"/>
+                <w:color w:val="1B1F24"/>
+                <w:sz w:val="20"/>
+                <w:szCs w:val="20"/>
+              </w:rPr>
+              <w:t xml:space="preserve">Câu lệnh cho Mầm non theo hoạt động chơi, trải nghiệm.</w:t>
+            </w:r>
+          </w:p>
+        </w:tc>
+        <w:tc>
+          <w:tcPr>
+            <w:tcW w:type="dxa" w:w="1400"/>
+            <w:tcBorders>
+              <w:top w:val="none" w:color="FFFFFF" w:sz="0"/>
+              <w:left w:val="none" w:color="FFFFFF" w:sz="0"/>
+              <w:bottom w:val="none" w:color="FFFFFF" w:sz="0"/>
+              <w:right w:val="none" w:color="FFFFFF" w:sz="0"/>
+            </w:tcBorders>
+            <w:shd w:fill="FFFFFF" w:color="auto" w:val="clear"/>
+            <w:tcMar>
+              <w:top w:type="dxa" w:w="90"/>
+              <w:left w:type="dxa" w:w="160"/>
+              <w:bottom w:type="dxa" w:w="90"/>
+              <w:right w:type="dxa" w:w="160"/>
+            </w:tcMar>
+          </w:tcPr>
+          <w:p>
+            <w:r>
+              <w:rPr>
+                <w:rFonts w:ascii="Arial" w:cs="Arial" w:eastAsia="Arial" w:hAnsi="Arial"/>
+                <w:b w:val="false"/>
+                <w:bCs w:val="false"/>
+                <w:color w:val="1B1F24"/>
+                <w:sz w:val="20"/>
+                <w:szCs w:val="20"/>
+              </w:rPr>
+              <w:t xml:space="preserve">Dòng Mầm non</w:t>
+            </w:r>
+          </w:p>
+        </w:tc>
+      </w:tr>
+      <w:tr>
+        <w:tc>
+          <w:tcPr>
+            <w:tcW w:type="dxa" w:w="3900"/>
+            <w:tcBorders>
+              <w:top w:val="none" w:color="FFFFFF" w:sz="0"/>
+              <w:left w:val="none" w:color="FFFFFF" w:sz="0"/>
+              <w:bottom w:val="none" w:color="FFFFFF" w:sz="0"/>
+              <w:right w:val="none" w:color="FFFFFF" w:sz="0"/>
+            </w:tcBorders>
+            <w:shd w:fill="F7F5F0" w:color="auto" w:val="clear"/>
+            <w:tcMar>
+              <w:top w:type="dxa" w:w="90"/>
+              <w:left w:type="dxa" w:w="160"/>
+              <w:bottom w:type="dxa" w:w="90"/>
+              <w:right w:type="dxa" w:w="160"/>
+            </w:tcMar>
+          </w:tcPr>
+          <w:p>
+            <w:r>
+              <w:rPr>
+                <w:rFonts w:ascii="Arial" w:cs="Arial" w:eastAsia="Arial" w:hAnsi="Arial"/>
+                <w:b/>
+                <w:bCs/>
+                <w:color w:val="1B1F24"/>
+                <w:sz w:val="20"/>
+                <w:szCs w:val="20"/>
+              </w:rPr>
+              <w:t xml:space="preserve">Hướng dẫn kiểm tra, đánh giá cấp THCS, THPT</w:t>
+            </w:r>
+            <w:r>
+              <w:rPr>
+                <w:rFonts w:ascii="Arial" w:cs="Arial" w:eastAsia="Arial" w:hAnsi="Arial"/>
+                <w:b w:val="false"/>
+                <w:bCs w:val="false"/>
+                <w:color w:val="1B1F24"/>
+                <w:sz w:val="20"/>
+                <w:szCs w:val="20"/>
+              </w:rPr>
+              <w:t xml:space="preserve">. Công văn 7991/BGDĐT-GDTrH ngày 17/12/2024</w:t>
+            </w:r>
+          </w:p>
+        </w:tc>
+        <w:tc>
+          <w:tcPr>
+            <w:tcW w:type="dxa" w:w="4338"/>
+            <w:tcBorders>
+              <w:top w:val="none" w:color="FFFFFF" w:sz="0"/>
+              <w:left w:val="none" w:color="FFFFFF" w:sz="0"/>
+              <w:bottom w:val="none" w:color="FFFFFF" w:sz="0"/>
+              <w:right w:val="none" w:color="FFFFFF" w:sz="0"/>
+            </w:tcBorders>
+            <w:shd w:fill="F7F5F0" w:color="auto" w:val="clear"/>
+            <w:tcMar>
+              <w:top w:type="dxa" w:w="90"/>
+              <w:left w:type="dxa" w:w="160"/>
+              <w:bottom w:type="dxa" w:w="90"/>
+              <w:right w:type="dxa" w:w="160"/>
+            </w:tcMar>
+          </w:tcPr>
+          <w:p>
+            <w:r>
+              <w:rPr>
+                <w:rFonts w:ascii="Arial" w:cs="Arial" w:eastAsia="Arial" w:hAnsi="Arial"/>
+                <w:b w:val="false"/>
+                <w:bCs w:val="false"/>
+                <w:color w:val="1B1F24"/>
+                <w:sz w:val="20"/>
+                <w:szCs w:val="20"/>
+              </w:rPr>
+              <w:t xml:space="preserve">Đề định kỳ đi kèm ma trận, bản đặc tả, hướng dẫn chấm.</w:t>
+            </w:r>
+          </w:p>
+        </w:tc>
+        <w:tc>
+          <w:tcPr>
+            <w:tcW w:type="dxa" w:w="1400"/>
+            <w:tcBorders>
+              <w:top w:val="none" w:color="FFFFFF" w:sz="0"/>
+              <w:left w:val="none" w:color="FFFFFF" w:sz="0"/>
+              <w:bottom w:val="none" w:color="FFFFFF" w:sz="0"/>
+              <w:right w:val="none" w:color="FFFFFF" w:sz="0"/>
+            </w:tcBorders>
+            <w:shd w:fill="F7F5F0" w:color="auto" w:val="clear"/>
+            <w:tcMar>
+              <w:top w:type="dxa" w:w="90"/>
+              <w:left w:type="dxa" w:w="160"/>
+              <w:bottom w:type="dxa" w:w="90"/>
+              <w:right w:type="dxa" w:w="160"/>
+            </w:tcMar>
+          </w:tcPr>
+          <w:p>
+            <w:r>
+              <w:rPr>
+                <w:rFonts w:ascii="Arial" w:cs="Arial" w:eastAsia="Arial" w:hAnsi="Arial"/>
+                <w:b w:val="false"/>
+                <w:bCs w:val="false"/>
+                <w:color w:val="1B1F24"/>
+                <w:sz w:val="20"/>
+                <w:szCs w:val="20"/>
+              </w:rPr>
+              <w:t xml:space="preserve">C5, C6</w:t>
+            </w:r>
+          </w:p>
+        </w:tc>
+      </w:tr>
+      <w:tr>
+        <w:tc>
+          <w:tcPr>
+            <w:tcW w:type="dxa" w:w="3900"/>
+            <w:tcBorders>
+              <w:top w:val="none" w:color="FFFFFF" w:sz="0"/>
+              <w:left w:val="none" w:color="FFFFFF" w:sz="0"/>
+              <w:bottom w:val="none" w:color="FFFFFF" w:sz="0"/>
+              <w:right w:val="none" w:color="FFFFFF" w:sz="0"/>
+            </w:tcBorders>
+            <w:shd w:fill="FFFFFF" w:color="auto" w:val="clear"/>
+            <w:tcMar>
+              <w:top w:type="dxa" w:w="90"/>
+              <w:left w:type="dxa" w:w="160"/>
+              <w:bottom w:type="dxa" w:w="90"/>
+              <w:right w:type="dxa" w:w="160"/>
+            </w:tcMar>
+          </w:tcPr>
+          <w:p>
+            <w:r>
+              <w:rPr>
+                <w:rFonts w:ascii="Arial" w:cs="Arial" w:eastAsia="Arial" w:hAnsi="Arial"/>
+                <w:b/>
+                <w:bCs/>
+                <w:color w:val="1B1F24"/>
+                <w:sz w:val="20"/>
+                <w:szCs w:val="20"/>
+              </w:rPr>
+              <w:t xml:space="preserve">Đánh giá học sinh THCS, THPT</w:t>
+            </w:r>
+            <w:r>
+              <w:rPr>
+                <w:rFonts w:ascii="Arial" w:cs="Arial" w:eastAsia="Arial" w:hAnsi="Arial"/>
+                <w:b w:val="false"/>
+                <w:bCs w:val="false"/>
+                <w:color w:val="1B1F24"/>
+                <w:sz w:val="20"/>
+                <w:szCs w:val="20"/>
+              </w:rPr>
+              <w:t xml:space="preserve">. Thông tư 22/2021/TT-BGDĐT</w:t>
+            </w:r>
+          </w:p>
+        </w:tc>
+        <w:tc>
+          <w:tcPr>
+            <w:tcW w:type="dxa" w:w="4338"/>
+            <w:tcBorders>
+              <w:top w:val="none" w:color="FFFFFF" w:sz="0"/>
+              <w:left w:val="none" w:color="FFFFFF" w:sz="0"/>
+              <w:bottom w:val="none" w:color="FFFFFF" w:sz="0"/>
+              <w:right w:val="none" w:color="FFFFFF" w:sz="0"/>
+            </w:tcBorders>
+            <w:shd w:fill="FFFFFF" w:color="auto" w:val="clear"/>
+            <w:tcMar>
+              <w:top w:type="dxa" w:w="90"/>
+              <w:left w:type="dxa" w:w="160"/>
+              <w:bottom w:type="dxa" w:w="90"/>
+              <w:right w:type="dxa" w:w="160"/>
+            </w:tcMar>
+          </w:tcPr>
+          <w:p>
+            <w:r>
+              <w:rPr>
+                <w:rFonts w:ascii="Arial" w:cs="Arial" w:eastAsia="Arial" w:hAnsi="Arial"/>
+                <w:b w:val="false"/>
+                <w:bCs w:val="false"/>
+                <w:color w:val="1B1F24"/>
+                <w:sz w:val="20"/>
+                <w:szCs w:val="20"/>
+              </w:rPr>
+              <w:t xml:space="preserve">Đánh giá thường xuyên, định kỳ.</w:t>
+            </w:r>
+          </w:p>
+        </w:tc>
+        <w:tc>
+          <w:tcPr>
+            <w:tcW w:type="dxa" w:w="1400"/>
+            <w:tcBorders>
+              <w:top w:val="none" w:color="FFFFFF" w:sz="0"/>
+              <w:left w:val="none" w:color="FFFFFF" w:sz="0"/>
+              <w:bottom w:val="none" w:color="FFFFFF" w:sz="0"/>
+              <w:right w:val="none" w:color="FFFFFF" w:sz="0"/>
+            </w:tcBorders>
+            <w:shd w:fill="FFFFFF" w:color="auto" w:val="clear"/>
+            <w:tcMar>
+              <w:top w:type="dxa" w:w="90"/>
+              <w:left w:type="dxa" w:w="160"/>
+              <w:bottom w:type="dxa" w:w="90"/>
+              <w:right w:type="dxa" w:w="160"/>
+            </w:tcMar>
+          </w:tcPr>
+          <w:p>
+            <w:r>
+              <w:rPr>
+                <w:rFonts w:ascii="Arial" w:cs="Arial" w:eastAsia="Arial" w:hAnsi="Arial"/>
+                <w:b w:val="false"/>
+                <w:bCs w:val="false"/>
+                <w:color w:val="1B1F24"/>
+                <w:sz w:val="20"/>
+                <w:szCs w:val="20"/>
+              </w:rPr>
+              <w:t xml:space="preserve">C3 đến C7</w:t>
+            </w:r>
+          </w:p>
+        </w:tc>
+      </w:tr>
+      <w:tr>
+        <w:tc>
+          <w:tcPr>
+            <w:tcW w:type="dxa" w:w="3900"/>
+            <w:tcBorders>
+              <w:top w:val="none" w:color="FFFFFF" w:sz="0"/>
+              <w:left w:val="none" w:color="FFFFFF" w:sz="0"/>
+              <w:bottom w:val="none" w:color="FFFFFF" w:sz="0"/>
+              <w:right w:val="none" w:color="FFFFFF" w:sz="0"/>
+            </w:tcBorders>
+            <w:shd w:fill="F7F5F0" w:color="auto" w:val="clear"/>
+            <w:tcMar>
+              <w:top w:type="dxa" w:w="90"/>
+              <w:left w:type="dxa" w:w="160"/>
+              <w:bottom w:type="dxa" w:w="90"/>
+              <w:right w:type="dxa" w:w="160"/>
+            </w:tcMar>
+          </w:tcPr>
+          <w:p>
+            <w:r>
+              <w:rPr>
+                <w:rFonts w:ascii="Arial" w:cs="Arial" w:eastAsia="Arial" w:hAnsi="Arial"/>
+                <w:b/>
+                <w:bCs/>
+                <w:color w:val="1B1F24"/>
+                <w:sz w:val="20"/>
+                <w:szCs w:val="20"/>
+              </w:rPr>
+              <w:t xml:space="preserve">Đánh giá học sinh tiểu học</w:t>
+            </w:r>
+            <w:r>
+              <w:rPr>
+                <w:rFonts w:ascii="Arial" w:cs="Arial" w:eastAsia="Arial" w:hAnsi="Arial"/>
+                <w:b w:val="false"/>
+                <w:bCs w:val="false"/>
+                <w:color w:val="1B1F24"/>
+                <w:sz w:val="20"/>
+                <w:szCs w:val="20"/>
+              </w:rPr>
+              <w:t xml:space="preserve">. Thông tư 27/2020/TT-BGDĐT</w:t>
+            </w:r>
+          </w:p>
+        </w:tc>
+        <w:tc>
+          <w:tcPr>
+            <w:tcW w:type="dxa" w:w="4338"/>
+            <w:tcBorders>
+              <w:top w:val="none" w:color="FFFFFF" w:sz="0"/>
+              <w:left w:val="none" w:color="FFFFFF" w:sz="0"/>
+              <w:bottom w:val="none" w:color="FFFFFF" w:sz="0"/>
+              <w:right w:val="none" w:color="FFFFFF" w:sz="0"/>
+            </w:tcBorders>
+            <w:shd w:fill="F7F5F0" w:color="auto" w:val="clear"/>
+            <w:tcMar>
+              <w:top w:type="dxa" w:w="90"/>
+              <w:left w:type="dxa" w:w="160"/>
+              <w:bottom w:type="dxa" w:w="90"/>
+              <w:right w:type="dxa" w:w="160"/>
+            </w:tcMar>
+          </w:tcPr>
+          <w:p>
+            <w:r>
+              <w:rPr>
+                <w:rFonts w:ascii="Arial" w:cs="Arial" w:eastAsia="Arial" w:hAnsi="Arial"/>
+                <w:b w:val="false"/>
+                <w:bCs w:val="false"/>
+                <w:color w:val="1B1F24"/>
+                <w:sz w:val="20"/>
+                <w:szCs w:val="20"/>
+              </w:rPr>
+              <w:t xml:space="preserve">Đánh giá vì sự tiến bộ, kết hợp nhận xét và điểm số.</w:t>
+            </w:r>
+          </w:p>
+        </w:tc>
+        <w:tc>
+          <w:tcPr>
+            <w:tcW w:type="dxa" w:w="1400"/>
+            <w:tcBorders>
+              <w:top w:val="none" w:color="FFFFFF" w:sz="0"/>
+              <w:left w:val="none" w:color="FFFFFF" w:sz="0"/>
+              <w:bottom w:val="none" w:color="FFFFFF" w:sz="0"/>
+              <w:right w:val="none" w:color="FFFFFF" w:sz="0"/>
+            </w:tcBorders>
+            <w:shd w:fill="F7F5F0" w:color="auto" w:val="clear"/>
+            <w:tcMar>
+              <w:top w:type="dxa" w:w="90"/>
+              <w:left w:type="dxa" w:w="160"/>
+              <w:bottom w:type="dxa" w:w="90"/>
+              <w:right w:type="dxa" w:w="160"/>
+            </w:tcMar>
+          </w:tcPr>
+          <w:p>
+            <w:r>
+              <w:rPr>
+                <w:rFonts w:ascii="Arial" w:cs="Arial" w:eastAsia="Arial" w:hAnsi="Arial"/>
+                <w:b w:val="false"/>
+                <w:bCs w:val="false"/>
+                <w:color w:val="1B1F24"/>
+                <w:sz w:val="20"/>
+                <w:szCs w:val="20"/>
+              </w:rPr>
+              <w:t xml:space="preserve">C4, C7</w:t>
+            </w:r>
+          </w:p>
+        </w:tc>
+      </w:tr>
+      <w:tr>
+        <w:tc>
+          <w:tcPr>
+            <w:tcW w:type="dxa" w:w="3900"/>
+            <w:tcBorders>
+              <w:top w:val="none" w:color="FFFFFF" w:sz="0"/>
+              <w:left w:val="none" w:color="FFFFFF" w:sz="0"/>
+              <w:bottom w:val="none" w:color="FFFFFF" w:sz="0"/>
+              <w:right w:val="none" w:color="FFFFFF" w:sz="0"/>
+            </w:tcBorders>
+            <w:shd w:fill="FFFFFF" w:color="auto" w:val="clear"/>
+            <w:tcMar>
+              <w:top w:type="dxa" w:w="90"/>
+              <w:left w:type="dxa" w:w="160"/>
+              <w:bottom w:type="dxa" w:w="90"/>
+              <w:right w:type="dxa" w:w="160"/>
+            </w:tcMar>
+          </w:tcPr>
+          <w:p>
+            <w:r>
+              <w:rPr>
+                <w:rFonts w:ascii="Arial" w:cs="Arial" w:eastAsia="Arial" w:hAnsi="Arial"/>
+                <w:b/>
+                <w:bCs/>
+                <w:color w:val="1B1F24"/>
+                <w:sz w:val="20"/>
+                <w:szCs w:val="20"/>
+              </w:rPr>
+              <w:t xml:space="preserve">Luật Sở hữu trí tuệ (sửa đổi 2022)</w:t>
+            </w:r>
+            <w:r>
+              <w:rPr>
+                <w:rFonts w:ascii="Arial" w:cs="Arial" w:eastAsia="Arial" w:hAnsi="Arial"/>
+                <w:b w:val="false"/>
+                <w:bCs w:val="false"/>
+                <w:color w:val="1B1F24"/>
+                <w:sz w:val="20"/>
+                <w:szCs w:val="20"/>
+              </w:rPr>
+              <w:t xml:space="preserve">. Điều 25: sử dụng tác phẩm không phải xin phép, không phải trả tiền</w:t>
+            </w:r>
+          </w:p>
+        </w:tc>
+        <w:tc>
+          <w:tcPr>
+            <w:tcW w:type="dxa" w:w="4338"/>
+            <w:tcBorders>
+              <w:top w:val="none" w:color="FFFFFF" w:sz="0"/>
+              <w:left w:val="none" w:color="FFFFFF" w:sz="0"/>
+              <w:bottom w:val="none" w:color="FFFFFF" w:sz="0"/>
+              <w:right w:val="none" w:color="FFFFFF" w:sz="0"/>
+            </w:tcBorders>
+            <w:shd w:fill="FFFFFF" w:color="auto" w:val="clear"/>
+            <w:tcMar>
+              <w:top w:type="dxa" w:w="90"/>
+              <w:left w:type="dxa" w:w="160"/>
+              <w:bottom w:type="dxa" w:w="90"/>
+              <w:right w:type="dxa" w:w="160"/>
+            </w:tcMar>
+          </w:tcPr>
+          <w:p>
+            <w:r>
+              <w:rPr>
+                <w:rFonts w:ascii="Arial" w:cs="Arial" w:eastAsia="Arial" w:hAnsi="Arial"/>
+                <w:b w:val="false"/>
+                <w:bCs w:val="false"/>
+                <w:color w:val="1B1F24"/>
+                <w:sz w:val="20"/>
+                <w:szCs w:val="20"/>
+              </w:rPr>
+              <w:t xml:space="preserve">Dùng SGK, tài liệu để minh họa giảng dạy hợp lý, ghi tên tác giả và nguồn.</w:t>
+            </w:r>
+          </w:p>
+        </w:tc>
+        <w:tc>
+          <w:tcPr>
+            <w:tcW w:type="dxa" w:w="1400"/>
+            <w:tcBorders>
+              <w:top w:val="none" w:color="FFFFFF" w:sz="0"/>
+              <w:left w:val="none" w:color="FFFFFF" w:sz="0"/>
+              <w:bottom w:val="none" w:color="FFFFFF" w:sz="0"/>
+              <w:right w:val="none" w:color="FFFFFF" w:sz="0"/>
+            </w:tcBorders>
+            <w:shd w:fill="FFFFFF" w:color="auto" w:val="clear"/>
+            <w:tcMar>
+              <w:top w:type="dxa" w:w="90"/>
+              <w:left w:type="dxa" w:w="160"/>
+              <w:bottom w:type="dxa" w:w="90"/>
+              <w:right w:type="dxa" w:w="160"/>
+            </w:tcMar>
+          </w:tcPr>
+          <w:p>
+            <w:r>
+              <w:rPr>
+                <w:rFonts w:ascii="Arial" w:cs="Arial" w:eastAsia="Arial" w:hAnsi="Arial"/>
+                <w:b w:val="false"/>
+                <w:bCs w:val="false"/>
+                <w:color w:val="1B1F24"/>
+                <w:sz w:val="20"/>
+                <w:szCs w:val="20"/>
+              </w:rPr>
+              <w:t xml:space="preserve">C4, C5, E4, E5</w:t>
+            </w:r>
+          </w:p>
+        </w:tc>
+      </w:tr>
+    </w:tbl>
+    <w:p>
+      <w:pPr>
+        <w:spacing w:after="200"/>
+      </w:pPr>
+    </w:p>
+    <w:p>
+      <w:r>
+        <w:br w:type="page"/>
+      </w:r>
+    </w:p>
+    <w:p>
+      <w:pPr>
+        <w:spacing w:after="80" w:before="600"/>
+      </w:pPr>
+      <w:r>
+        <w:rPr>
+          <w:rFonts w:ascii="Arial" w:cs="Arial" w:eastAsia="Arial" w:hAnsi="Arial"/>
+          <w:color w:val="A67C3D"/>
+          <w:spacing w:val="60"/>
+          <w:sz w:val="18"/>
+          <w:szCs w:val="18"/>
+        </w:rPr>
         <w:t xml:space="preserve">PHẦN A</w:t>
       </w:r>
     </w:p>
@@ -1796,6 +4197,32 @@
           <w:szCs w:val="32"/>
         </w:rPr>
         <w:t xml:space="preserve">   AI là trợ lý, thầy cô là người quyết định</w:t>
+      </w:r>
+    </w:p>
+    <w:p>
+      <w:pPr>
+        <w:spacing w:after="140"/>
+      </w:pPr>
+      <w:r>
+        <w:rPr>
+          <w:rFonts w:ascii="Arial" w:cs="Arial" w:eastAsia="Arial" w:hAnsi="Arial"/>
+          <w:color w:val="A67C3D"/>
+          <w:spacing w:val="40"/>
+          <w:sz w:val="15"/>
+          <w:szCs w:val="15"/>
+        </w:rPr>
+        <w:t xml:space="preserve">CĂN CỨ  </w:t>
+      </w:r>
+      <w:r>
+        <w:rPr>
+          <w:rFonts w:ascii="Arial" w:cs="Arial" w:eastAsia="Arial" w:hAnsi="Arial"/>
+          <w:i/>
+          <w:iCs/>
+          <w:color w:val="6B6B6B"/>
+          <w:sz w:val="17"/>
+          <w:szCs w:val="17"/>
+        </w:rPr>
+        <w:t xml:space="preserve">Luật Trí tuệ nhân tạo 134/2025/QH15  ·  Quyết định 1671/QĐ-TTg</w:t>
       </w:r>
     </w:p>
     <w:p>
@@ -6121,6 +8548,32 @@
         <w:t xml:space="preserve">   Mô hình TPACK</w:t>
       </w:r>
     </w:p>
+    <w:p>
+      <w:pPr>
+        <w:spacing w:after="140"/>
+      </w:pPr>
+      <w:r>
+        <w:rPr>
+          <w:rFonts w:ascii="Arial" w:cs="Arial" w:eastAsia="Arial" w:hAnsi="Arial"/>
+          <w:color w:val="A67C3D"/>
+          <w:spacing w:val="40"/>
+          <w:sz w:val="15"/>
+          <w:szCs w:val="15"/>
+        </w:rPr>
+        <w:t xml:space="preserve">CĂN CỨ  </w:t>
+      </w:r>
+      <w:r>
+        <w:rPr>
+          <w:rFonts w:ascii="Arial" w:cs="Arial" w:eastAsia="Arial" w:hAnsi="Arial"/>
+          <w:i/>
+          <w:iCs/>
+          <w:color w:val="6B6B6B"/>
+          <w:sz w:val="17"/>
+          <w:szCs w:val="17"/>
+        </w:rPr>
+        <w:t xml:space="preserve">Công văn 5835/BGDĐT-KHCNTT  ·  Thông tư 32/2018/TT-BGDĐT</w:t>
+      </w:r>
+    </w:p>
     <w:tbl>
       <w:tblPr>
         <w:tblW w:type="dxa" w:w="9638"/>
@@ -6671,6 +9124,32 @@
         <w:t xml:space="preserve">   Kế hoạch bài dạy theo kỹ thuật dạy học tích cực</w:t>
       </w:r>
     </w:p>
+    <w:p>
+      <w:pPr>
+        <w:spacing w:after="140"/>
+      </w:pPr>
+      <w:r>
+        <w:rPr>
+          <w:rFonts w:ascii="Arial" w:cs="Arial" w:eastAsia="Arial" w:hAnsi="Arial"/>
+          <w:color w:val="A67C3D"/>
+          <w:spacing w:val="40"/>
+          <w:sz w:val="15"/>
+          <w:szCs w:val="15"/>
+        </w:rPr>
+        <w:t xml:space="preserve">CĂN CỨ  </w:t>
+      </w:r>
+      <w:r>
+        <w:rPr>
+          <w:rFonts w:ascii="Arial" w:cs="Arial" w:eastAsia="Arial" w:hAnsi="Arial"/>
+          <w:i/>
+          <w:iCs/>
+          <w:color w:val="6B6B6B"/>
+          <w:sz w:val="17"/>
+          <w:szCs w:val="17"/>
+        </w:rPr>
+        <w:t xml:space="preserve">Thông tư 32/2018/TT-BGDĐT  ·  Văn bản hợp nhất 01/VBHN-BGDĐT</w:t>
+      </w:r>
+    </w:p>
     <w:tbl>
       <w:tblPr>
         <w:tblW w:type="dxa" w:w="9638"/>
@@ -7164,6 +9643,32 @@
         <w:t xml:space="preserve">   Kế hoạch bài dạy STEM, STEAM</w:t>
       </w:r>
     </w:p>
+    <w:p>
+      <w:pPr>
+        <w:spacing w:after="140"/>
+      </w:pPr>
+      <w:r>
+        <w:rPr>
+          <w:rFonts w:ascii="Arial" w:cs="Arial" w:eastAsia="Arial" w:hAnsi="Arial"/>
+          <w:color w:val="A67C3D"/>
+          <w:spacing w:val="40"/>
+          <w:sz w:val="15"/>
+          <w:szCs w:val="15"/>
+        </w:rPr>
+        <w:t xml:space="preserve">CĂN CỨ  </w:t>
+      </w:r>
+      <w:r>
+        <w:rPr>
+          <w:rFonts w:ascii="Arial" w:cs="Arial" w:eastAsia="Arial" w:hAnsi="Arial"/>
+          <w:i/>
+          <w:iCs/>
+          <w:color w:val="6B6B6B"/>
+          <w:sz w:val="17"/>
+          <w:szCs w:val="17"/>
+        </w:rPr>
+        <w:t xml:space="preserve">Công văn 5835/BGDĐT-KHCNTT  ·  Thông tư 32/2018/TT-BGDĐT</w:t>
+      </w:r>
+    </w:p>
     <w:tbl>
       <w:tblPr>
         <w:tblW w:type="dxa" w:w="9638"/>
@@ -7650,6 +10155,32 @@
     </w:p>
     <w:p>
       <w:pPr>
+        <w:spacing w:after="140"/>
+      </w:pPr>
+      <w:r>
+        <w:rPr>
+          <w:rFonts w:ascii="Arial" w:cs="Arial" w:eastAsia="Arial" w:hAnsi="Arial"/>
+          <w:color w:val="A67C3D"/>
+          <w:spacing w:val="40"/>
+          <w:sz w:val="15"/>
+          <w:szCs w:val="15"/>
+        </w:rPr>
+        <w:t xml:space="preserve">CĂN CỨ  </w:t>
+      </w:r>
+      <w:r>
+        <w:rPr>
+          <w:rFonts w:ascii="Arial" w:cs="Arial" w:eastAsia="Arial" w:hAnsi="Arial"/>
+          <w:i/>
+          <w:iCs/>
+          <w:color w:val="6B6B6B"/>
+          <w:sz w:val="17"/>
+          <w:szCs w:val="17"/>
+        </w:rPr>
+        <w:t xml:space="preserve">Thông tư 22/2021/TT-BGDĐT  ·  Thông tư 32/2018/TT-BGDĐT</w:t>
+      </w:r>
+    </w:p>
+    <w:p>
+      <w:pPr>
         <w:spacing w:after="120" w:line="300"/>
       </w:pPr>
       <w:r>
@@ -8152,6 +10683,32 @@
         <w:t xml:space="preserve">   Đề trắc nghiệm có đính kèm tài liệu</w:t>
       </w:r>
     </w:p>
+    <w:p>
+      <w:pPr>
+        <w:spacing w:after="140"/>
+      </w:pPr>
+      <w:r>
+        <w:rPr>
+          <w:rFonts w:ascii="Arial" w:cs="Arial" w:eastAsia="Arial" w:hAnsi="Arial"/>
+          <w:color w:val="A67C3D"/>
+          <w:spacing w:val="40"/>
+          <w:sz w:val="15"/>
+          <w:szCs w:val="15"/>
+        </w:rPr>
+        <w:t xml:space="preserve">CĂN CỨ  </w:t>
+      </w:r>
+      <w:r>
+        <w:rPr>
+          <w:rFonts w:ascii="Arial" w:cs="Arial" w:eastAsia="Arial" w:hAnsi="Arial"/>
+          <w:i/>
+          <w:iCs/>
+          <w:color w:val="6B6B6B"/>
+          <w:sz w:val="17"/>
+          <w:szCs w:val="17"/>
+        </w:rPr>
+        <w:t xml:space="preserve">Thông tư 27/2020/TT-BGDĐT  ·  Luật Sở hữu trí tuệ Điều 25</w:t>
+      </w:r>
+    </w:p>
     <w:tbl>
       <w:tblPr>
         <w:tblW w:type="dxa" w:w="9638"/>
@@ -8445,6 +11002,32 @@
           <w:szCs w:val="32"/>
         </w:rPr>
         <w:t xml:space="preserve">   Câu lệnh nâng cao: chia 4 ngăn có tiêu đề #</w:t>
+      </w:r>
+    </w:p>
+    <w:p>
+      <w:pPr>
+        <w:spacing w:after="140"/>
+      </w:pPr>
+      <w:r>
+        <w:rPr>
+          <w:rFonts w:ascii="Arial" w:cs="Arial" w:eastAsia="Arial" w:hAnsi="Arial"/>
+          <w:color w:val="A67C3D"/>
+          <w:spacing w:val="40"/>
+          <w:sz w:val="15"/>
+          <w:szCs w:val="15"/>
+        </w:rPr>
+        <w:t xml:space="preserve">CĂN CỨ  </w:t>
+      </w:r>
+      <w:r>
+        <w:rPr>
+          <w:rFonts w:ascii="Arial" w:cs="Arial" w:eastAsia="Arial" w:hAnsi="Arial"/>
+          <w:i/>
+          <w:iCs/>
+          <w:color w:val="6B6B6B"/>
+          <w:sz w:val="17"/>
+          <w:szCs w:val="17"/>
+        </w:rPr>
+        <w:t xml:space="preserve">Công văn 7991/BGDĐT-GDTrH  ·  Thông tư 22/2021/TT-BGDĐT  ·  Luật Sở hữu trí tuệ Điều 25</w:t>
       </w:r>
     </w:p>
     <w:tbl>
@@ -9239,6 +11822,32 @@
         <w:t xml:space="preserve">   Đề thi theo ma trận và bản đặc tả</w:t>
       </w:r>
     </w:p>
+    <w:p>
+      <w:pPr>
+        <w:spacing w:after="140"/>
+      </w:pPr>
+      <w:r>
+        <w:rPr>
+          <w:rFonts w:ascii="Arial" w:cs="Arial" w:eastAsia="Arial" w:hAnsi="Arial"/>
+          <w:color w:val="A67C3D"/>
+          <w:spacing w:val="40"/>
+          <w:sz w:val="15"/>
+          <w:szCs w:val="15"/>
+        </w:rPr>
+        <w:t xml:space="preserve">CĂN CỨ  </w:t>
+      </w:r>
+      <w:r>
+        <w:rPr>
+          <w:rFonts w:ascii="Arial" w:cs="Arial" w:eastAsia="Arial" w:hAnsi="Arial"/>
+          <w:i/>
+          <w:iCs/>
+          <w:color w:val="6B6B6B"/>
+          <w:sz w:val="17"/>
+          <w:szCs w:val="17"/>
+        </w:rPr>
+        <w:t xml:space="preserve">Công văn 7991/BGDĐT-GDTrH  ·  Thông tư 22/2021/TT-BGDĐT</w:t>
+      </w:r>
+    </w:p>
     <w:tbl>
       <w:tblPr>
         <w:tblW w:type="dxa" w:w="9638"/>
@@ -9808,6 +12417,32 @@
         <w:t xml:space="preserve">   Xây dựng tiêu chí đánh giá (rubric)</w:t>
       </w:r>
     </w:p>
+    <w:p>
+      <w:pPr>
+        <w:spacing w:after="140"/>
+      </w:pPr>
+      <w:r>
+        <w:rPr>
+          <w:rFonts w:ascii="Arial" w:cs="Arial" w:eastAsia="Arial" w:hAnsi="Arial"/>
+          <w:color w:val="A67C3D"/>
+          <w:spacing w:val="40"/>
+          <w:sz w:val="15"/>
+          <w:szCs w:val="15"/>
+        </w:rPr>
+        <w:t xml:space="preserve">CĂN CỨ  </w:t>
+      </w:r>
+      <w:r>
+        <w:rPr>
+          <w:rFonts w:ascii="Arial" w:cs="Arial" w:eastAsia="Arial" w:hAnsi="Arial"/>
+          <w:i/>
+          <w:iCs/>
+          <w:color w:val="6B6B6B"/>
+          <w:sz w:val="17"/>
+          <w:szCs w:val="17"/>
+        </w:rPr>
+        <w:t xml:space="preserve">Thông tư 27/2020/TT-BGDĐT  ·  Thông tư 22/2021/TT-BGDĐT</w:t>
+      </w:r>
+    </w:p>
     <w:tbl>
       <w:tblPr>
         <w:tblW w:type="dxa" w:w="9638"/>
@@ -11324,6 +13959,32 @@
         <w:t xml:space="preserve">   Tạo ảnh với các phong cách</w:t>
       </w:r>
     </w:p>
+    <w:p>
+      <w:pPr>
+        <w:spacing w:after="140"/>
+      </w:pPr>
+      <w:r>
+        <w:rPr>
+          <w:rFonts w:ascii="Arial" w:cs="Arial" w:eastAsia="Arial" w:hAnsi="Arial"/>
+          <w:color w:val="A67C3D"/>
+          <w:spacing w:val="40"/>
+          <w:sz w:val="15"/>
+          <w:szCs w:val="15"/>
+        </w:rPr>
+        <w:t xml:space="preserve">CĂN CỨ  </w:t>
+      </w:r>
+      <w:r>
+        <w:rPr>
+          <w:rFonts w:ascii="Arial" w:cs="Arial" w:eastAsia="Arial" w:hAnsi="Arial"/>
+          <w:i/>
+          <w:iCs/>
+          <w:color w:val="6B6B6B"/>
+          <w:sz w:val="17"/>
+          <w:szCs w:val="17"/>
+        </w:rPr>
+        <w:t xml:space="preserve">Luật Trí tuệ nhân tạo 134/2025/QH15</w:t>
+      </w:r>
+    </w:p>
     <w:tbl>
       <w:tblPr>
         <w:tblW w:type="dxa" w:w="9638"/>
@@ -13341,6 +16002,32 @@
         <w:t xml:space="preserve">   Sáng tác bài hát cho trẻ</w:t>
       </w:r>
     </w:p>
+    <w:p>
+      <w:pPr>
+        <w:spacing w:after="140"/>
+      </w:pPr>
+      <w:r>
+        <w:rPr>
+          <w:rFonts w:ascii="Arial" w:cs="Arial" w:eastAsia="Arial" w:hAnsi="Arial"/>
+          <w:color w:val="A67C3D"/>
+          <w:spacing w:val="40"/>
+          <w:sz w:val="15"/>
+          <w:szCs w:val="15"/>
+        </w:rPr>
+        <w:t xml:space="preserve">CĂN CỨ  </w:t>
+      </w:r>
+      <w:r>
+        <w:rPr>
+          <w:rFonts w:ascii="Arial" w:cs="Arial" w:eastAsia="Arial" w:hAnsi="Arial"/>
+          <w:i/>
+          <w:iCs/>
+          <w:color w:val="6B6B6B"/>
+          <w:sz w:val="17"/>
+          <w:szCs w:val="17"/>
+        </w:rPr>
+        <w:t xml:space="preserve">Luật Trí tuệ nhân tạo 134/2025/QH15  ·  Văn bản hợp nhất 01/VBHN-BGDĐT</w:t>
+      </w:r>
+    </w:p>
     <w:tbl>
       <w:tblPr>
         <w:tblW w:type="dxa" w:w="9638"/>
@@ -14624,6 +17311,32 @@
           <w:szCs w:val="32"/>
         </w:rPr>
         <w:t xml:space="preserve">   Chỉ định phong cách đọc (tạo giọng đọc)</w:t>
+      </w:r>
+    </w:p>
+    <w:p>
+      <w:pPr>
+        <w:spacing w:after="140"/>
+      </w:pPr>
+      <w:r>
+        <w:rPr>
+          <w:rFonts w:ascii="Arial" w:cs="Arial" w:eastAsia="Arial" w:hAnsi="Arial"/>
+          <w:color w:val="A67C3D"/>
+          <w:spacing w:val="40"/>
+          <w:sz w:val="15"/>
+          <w:szCs w:val="15"/>
+        </w:rPr>
+        <w:t xml:space="preserve">CĂN CỨ  </w:t>
+      </w:r>
+      <w:r>
+        <w:rPr>
+          <w:rFonts w:ascii="Arial" w:cs="Arial" w:eastAsia="Arial" w:hAnsi="Arial"/>
+          <w:i/>
+          <w:iCs/>
+          <w:color w:val="6B6B6B"/>
+          <w:sz w:val="17"/>
+          <w:szCs w:val="17"/>
+        </w:rPr>
+        <w:t xml:space="preserve">Luật Trí tuệ nhân tạo 134/2025/QH15</w:t>
       </w:r>
     </w:p>
     <w:tbl>
@@ -15215,6 +17928,32 @@
         <w:t xml:space="preserve">   Tạo đoạn hội thoại hai giọng</w:t>
       </w:r>
     </w:p>
+    <w:p>
+      <w:pPr>
+        <w:spacing w:after="140"/>
+      </w:pPr>
+      <w:r>
+        <w:rPr>
+          <w:rFonts w:ascii="Arial" w:cs="Arial" w:eastAsia="Arial" w:hAnsi="Arial"/>
+          <w:color w:val="A67C3D"/>
+          <w:spacing w:val="40"/>
+          <w:sz w:val="15"/>
+          <w:szCs w:val="15"/>
+        </w:rPr>
+        <w:t xml:space="preserve">CĂN CỨ  </w:t>
+      </w:r>
+      <w:r>
+        <w:rPr>
+          <w:rFonts w:ascii="Arial" w:cs="Arial" w:eastAsia="Arial" w:hAnsi="Arial"/>
+          <w:i/>
+          <w:iCs/>
+          <w:color w:val="6B6B6B"/>
+          <w:sz w:val="17"/>
+          <w:szCs w:val="17"/>
+        </w:rPr>
+        <w:t xml:space="preserve">Luật Trí tuệ nhân tạo 134/2025/QH15</w:t>
+      </w:r>
+    </w:p>
     <w:tbl>
       <w:tblPr>
         <w:tblW w:type="dxa" w:w="9638"/>
@@ -16013,6 +18752,32 @@
           <w:szCs w:val="32"/>
         </w:rPr>
         <w:t xml:space="preserve">   Deep Research: báo cáo chuyên sâu phục vụ giảng dạy</w:t>
+      </w:r>
+    </w:p>
+    <w:p>
+      <w:pPr>
+        <w:spacing w:after="140"/>
+      </w:pPr>
+      <w:r>
+        <w:rPr>
+          <w:rFonts w:ascii="Arial" w:cs="Arial" w:eastAsia="Arial" w:hAnsi="Arial"/>
+          <w:color w:val="A67C3D"/>
+          <w:spacing w:val="40"/>
+          <w:sz w:val="15"/>
+          <w:szCs w:val="15"/>
+        </w:rPr>
+        <w:t xml:space="preserve">CĂN CỨ  </w:t>
+      </w:r>
+      <w:r>
+        <w:rPr>
+          <w:rFonts w:ascii="Arial" w:cs="Arial" w:eastAsia="Arial" w:hAnsi="Arial"/>
+          <w:i/>
+          <w:iCs/>
+          <w:color w:val="6B6B6B"/>
+          <w:sz w:val="17"/>
+          <w:szCs w:val="17"/>
+        </w:rPr>
+        <w:t xml:space="preserve">Công văn 5835/BGDĐT-KHCNTT</w:t>
       </w:r>
     </w:p>
     <w:tbl>
@@ -16872,6 +19637,32 @@
         <w:t xml:space="preserve">   Xây dựng chatbot trợ giảng với Google Gemini</w:t>
       </w:r>
     </w:p>
+    <w:p>
+      <w:pPr>
+        <w:spacing w:after="140"/>
+      </w:pPr>
+      <w:r>
+        <w:rPr>
+          <w:rFonts w:ascii="Arial" w:cs="Arial" w:eastAsia="Arial" w:hAnsi="Arial"/>
+          <w:color w:val="A67C3D"/>
+          <w:spacing w:val="40"/>
+          <w:sz w:val="15"/>
+          <w:szCs w:val="15"/>
+        </w:rPr>
+        <w:t xml:space="preserve">CĂN CỨ  </w:t>
+      </w:r>
+      <w:r>
+        <w:rPr>
+          <w:rFonts w:ascii="Arial" w:cs="Arial" w:eastAsia="Arial" w:hAnsi="Arial"/>
+          <w:i/>
+          <w:iCs/>
+          <w:color w:val="6B6B6B"/>
+          <w:sz w:val="17"/>
+          <w:szCs w:val="17"/>
+        </w:rPr>
+        <w:t xml:space="preserve">Thông tư 02/2025/TT-BGDĐT  ·  Luật Bảo vệ dữ liệu cá nhân 91/2025/QH15  ·  Luật Sở hữu trí tuệ Điều 25</w:t>
+      </w:r>
+    </w:p>
     <w:tbl>
       <w:tblPr>
         <w:tblW w:type="dxa" w:w="9638"/>
@@ -17729,6 +20520,32 @@
         <w:t xml:space="preserve">   Xây dựng chatbot với Poe</w:t>
       </w:r>
     </w:p>
+    <w:p>
+      <w:pPr>
+        <w:spacing w:after="140"/>
+      </w:pPr>
+      <w:r>
+        <w:rPr>
+          <w:rFonts w:ascii="Arial" w:cs="Arial" w:eastAsia="Arial" w:hAnsi="Arial"/>
+          <w:color w:val="A67C3D"/>
+          <w:spacing w:val="40"/>
+          <w:sz w:val="15"/>
+          <w:szCs w:val="15"/>
+        </w:rPr>
+        <w:t xml:space="preserve">CĂN CỨ  </w:t>
+      </w:r>
+      <w:r>
+        <w:rPr>
+          <w:rFonts w:ascii="Arial" w:cs="Arial" w:eastAsia="Arial" w:hAnsi="Arial"/>
+          <w:i/>
+          <w:iCs/>
+          <w:color w:val="6B6B6B"/>
+          <w:sz w:val="17"/>
+          <w:szCs w:val="17"/>
+        </w:rPr>
+        <w:t xml:space="preserve">Thông tư 02/2025/TT-BGDĐT  ·  Luật Bảo vệ dữ liệu cá nhân 91/2025/QH15  ·  Luật Sở hữu trí tuệ Điều 25</w:t>
+      </w:r>
+    </w:p>
     <w:tbl>
       <w:tblPr>
         <w:tblW w:type="dxa" w:w="9638"/>
@@ -18225,6 +21042,32 @@
         <w:t xml:space="preserve">   Magic School: chatbot dựng sẵn cho giáo viên</w:t>
       </w:r>
     </w:p>
+    <w:p>
+      <w:pPr>
+        <w:spacing w:after="140"/>
+      </w:pPr>
+      <w:r>
+        <w:rPr>
+          <w:rFonts w:ascii="Arial" w:cs="Arial" w:eastAsia="Arial" w:hAnsi="Arial"/>
+          <w:color w:val="A67C3D"/>
+          <w:spacing w:val="40"/>
+          <w:sz w:val="15"/>
+          <w:szCs w:val="15"/>
+        </w:rPr>
+        <w:t xml:space="preserve">CĂN CỨ  </w:t>
+      </w:r>
+      <w:r>
+        <w:rPr>
+          <w:rFonts w:ascii="Arial" w:cs="Arial" w:eastAsia="Arial" w:hAnsi="Arial"/>
+          <w:i/>
+          <w:iCs/>
+          <w:color w:val="6B6B6B"/>
+          <w:sz w:val="17"/>
+          <w:szCs w:val="17"/>
+        </w:rPr>
+        <w:t xml:space="preserve">Luật Bảo vệ dữ liệu cá nhân 91/2025/QH15</w:t>
+      </w:r>
+    </w:p>
     <w:tbl>
       <w:tblPr>
         <w:tblW w:type="dxa" w:w="9638"/>
@@ -18776,6 +21619,32 @@
           <w:szCs w:val="32"/>
         </w:rPr>
         <w:t xml:space="preserve">   Khung năng lực AI cho giáo viên của UNESCO</w:t>
+      </w:r>
+    </w:p>
+    <w:p>
+      <w:pPr>
+        <w:spacing w:after="140"/>
+      </w:pPr>
+      <w:r>
+        <w:rPr>
+          <w:rFonts w:ascii="Arial" w:cs="Arial" w:eastAsia="Arial" w:hAnsi="Arial"/>
+          <w:color w:val="A67C3D"/>
+          <w:spacing w:val="40"/>
+          <w:sz w:val="15"/>
+          <w:szCs w:val="15"/>
+        </w:rPr>
+        <w:t xml:space="preserve">CĂN CỨ  </w:t>
+      </w:r>
+      <w:r>
+        <w:rPr>
+          <w:rFonts w:ascii="Arial" w:cs="Arial" w:eastAsia="Arial" w:hAnsi="Arial"/>
+          <w:i/>
+          <w:iCs/>
+          <w:color w:val="6B6B6B"/>
+          <w:sz w:val="17"/>
+          <w:szCs w:val="17"/>
+        </w:rPr>
+        <w:t xml:space="preserve">UNESCO  ·  Quyết định 3439/QĐ-BGDĐT  ·  Luật Trí tuệ nhân tạo 134/2025/QH15</w:t>
       </w:r>
     </w:p>
     <w:p>
@@ -18897,6 +21766,80 @@
     </w:p>
     <w:p>
       <w:pPr>
+        <w:spacing w:after="120" w:line="300"/>
+      </w:pPr>
+      <w:r>
+        <w:rPr>
+          <w:rFonts w:ascii="Arial" w:cs="Arial" w:eastAsia="Arial" w:hAnsi="Arial"/>
+          <w:color w:val="1B1F24"/>
+          <w:sz w:val="22"/>
+          <w:szCs w:val="22"/>
+        </w:rPr>
+        <w:t xml:space="preserve">Ở Việt Nam, Quyết định 3439/QĐ-BGDĐT (15/12/2025) cũng xây dựng nội dung giáo dục AI cho học sinh phổ thông theo 4 mạch, trong đó có </w:t>
+      </w:r>
+      <w:r>
+        <w:rPr>
+          <w:rFonts w:ascii="Arial" w:cs="Arial" w:eastAsia="Arial" w:hAnsi="Arial"/>
+          <w:b/>
+          <w:bCs/>
+          <w:color w:val="1B1F24"/>
+          <w:sz w:val="22"/>
+          <w:szCs w:val="22"/>
+        </w:rPr>
+        <w:t xml:space="preserve">tư duy lấy con người làm trung tâm</w:t>
+      </w:r>
+      <w:r>
+        <w:rPr>
+          <w:rFonts w:ascii="Arial" w:cs="Arial" w:eastAsia="Arial" w:hAnsi="Arial"/>
+          <w:color w:val="1B1F24"/>
+          <w:sz w:val="22"/>
+          <w:szCs w:val="22"/>
+        </w:rPr>
+        <w:t xml:space="preserve"> và </w:t>
+      </w:r>
+      <w:r>
+        <w:rPr>
+          <w:rFonts w:ascii="Arial" w:cs="Arial" w:eastAsia="Arial" w:hAnsi="Arial"/>
+          <w:b/>
+          <w:bCs/>
+          <w:color w:val="1B1F24"/>
+          <w:sz w:val="22"/>
+          <w:szCs w:val="22"/>
+        </w:rPr>
+        <w:t xml:space="preserve">đạo đức AI</w:t>
+      </w:r>
+      <w:r>
+        <w:rPr>
+          <w:rFonts w:ascii="Arial" w:cs="Arial" w:eastAsia="Arial" w:hAnsi="Arial"/>
+          <w:color w:val="1B1F24"/>
+          <w:sz w:val="22"/>
+          <w:szCs w:val="22"/>
+        </w:rPr>
+        <w:t xml:space="preserve">. Luật Trí tuệ nhân tạo 2025 khẳng định AI là công cụ hỗ trợ, con người quyết định cuối cùng. Vì vậy mọi bài trong sách đều kết thúc bằng bước </w:t>
+      </w:r>
+      <w:r>
+        <w:rPr>
+          <w:rFonts w:ascii="Arial" w:cs="Arial" w:eastAsia="Arial" w:hAnsi="Arial"/>
+          <w:b/>
+          <w:bCs/>
+          <w:color w:val="1B1F24"/>
+          <w:sz w:val="22"/>
+          <w:szCs w:val="22"/>
+        </w:rPr>
+        <w:t xml:space="preserve">Kiểm</w:t>
+      </w:r>
+      <w:r>
+        <w:rPr>
+          <w:rFonts w:ascii="Arial" w:cs="Arial" w:eastAsia="Arial" w:hAnsi="Arial"/>
+          <w:color w:val="1B1F24"/>
+          <w:sz w:val="22"/>
+          <w:szCs w:val="22"/>
+        </w:rPr>
+        <w:t xml:space="preserve"> của giáo viên.</w:t>
+      </w:r>
+    </w:p>
+    <w:p>
+      <w:pPr>
         <w:pStyle w:val="ListParagraph"/>
         <w:numPr>
           <w:ilvl w:val="0"/>
@@ -19075,6 +22018,32 @@
           <w:szCs w:val="32"/>
         </w:rPr>
         <w:t xml:space="preserve">   Ba màu đèn trước khi dán thông tin vào AI</w:t>
+      </w:r>
+    </w:p>
+    <w:p>
+      <w:pPr>
+        <w:spacing w:after="140"/>
+      </w:pPr>
+      <w:r>
+        <w:rPr>
+          <w:rFonts w:ascii="Arial" w:cs="Arial" w:eastAsia="Arial" w:hAnsi="Arial"/>
+          <w:color w:val="A67C3D"/>
+          <w:spacing w:val="40"/>
+          <w:sz w:val="15"/>
+          <w:szCs w:val="15"/>
+        </w:rPr>
+        <w:t xml:space="preserve">CĂN CỨ  </w:t>
+      </w:r>
+      <w:r>
+        <w:rPr>
+          <w:rFonts w:ascii="Arial" w:cs="Arial" w:eastAsia="Arial" w:hAnsi="Arial"/>
+          <w:i/>
+          <w:iCs/>
+          <w:color w:val="6B6B6B"/>
+          <w:sz w:val="17"/>
+          <w:szCs w:val="17"/>
+        </w:rPr>
+        <w:t xml:space="preserve">Luật Bảo vệ dữ liệu cá nhân 91/2025/QH15  ·  Luật Sở hữu trí tuệ Điều 25</w:t>
       </w:r>
     </w:p>
     <w:p>
@@ -19316,6 +22285,44 @@
           <w:sz w:val="22"/>
           <w:szCs w:val="22"/>
         </w:rPr>
+        <w:t xml:space="preserve">Ảnh, giọng đọc, video do AI tạo ra đã có ghi chú nhận biết, ví dụ "Hình ảnh tạo bởi AI" (Luật Trí tuệ nhân tạo 2025).</w:t>
+      </w:r>
+    </w:p>
+    <w:p>
+      <w:pPr>
+        <w:pStyle w:val="ListParagraph"/>
+        <w:numPr>
+          <w:ilvl w:val="0"/>
+          <w:numId w:val="13"/>
+        </w:numPr>
+        <w:spacing w:after="100" w:line="290"/>
+      </w:pPr>
+      <w:r>
+        <w:rPr>
+          <w:rFonts w:ascii="Arial" w:cs="Arial" w:eastAsia="Arial" w:hAnsi="Arial"/>
+          <w:color w:val="1B1F24"/>
+          <w:sz w:val="22"/>
+          <w:szCs w:val="22"/>
+        </w:rPr>
+        <w:t xml:space="preserve">Tài liệu dùng làm nguồn (SGK, bài báo) đã ghi tên tác giả và nguồn gốc (Luật Sở hữu trí tuệ, Điều 25).</w:t>
+      </w:r>
+    </w:p>
+    <w:p>
+      <w:pPr>
+        <w:pStyle w:val="ListParagraph"/>
+        <w:numPr>
+          <w:ilvl w:val="0"/>
+          <w:numId w:val="13"/>
+        </w:numPr>
+        <w:spacing w:after="100" w:line="290"/>
+      </w:pPr>
+      <w:r>
+        <w:rPr>
+          <w:rFonts w:ascii="Arial" w:cs="Arial" w:eastAsia="Arial" w:hAnsi="Arial"/>
+          <w:color w:val="1B1F24"/>
+          <w:sz w:val="22"/>
+          <w:szCs w:val="22"/>
+        </w:rPr>
         <w:t xml:space="preserve">Nếu dùng AI hỗ trợ soạn, thầy cô sẵn sàng giải thích với đồng nghiệp, phụ huynh cách mình đã dùng.</w:t>
       </w:r>
     </w:p>
@@ -21695,7 +24702,7 @@
       <w:pPr>
         <w:spacing w:after="120"/>
       </w:pPr>
-      <w:hyperlink w:history="1" r:id="rId26s3bduhck6szfqmvuomp">
+      <w:hyperlink w:history="1" r:id="rIdl3u8no8z_vmeyvd5x5czm">
         <w:r>
           <w:rPr>
             <w:rFonts w:ascii="Arial" w:cs="Arial" w:eastAsia="Arial" w:hAnsi="Arial"/>
@@ -21728,7 +24735,7 @@
       <w:pPr>
         <w:spacing w:after="120"/>
       </w:pPr>
-      <w:hyperlink w:history="1" r:id="rId3k_v1c7ktlxl3ou2efdyn">
+      <w:hyperlink w:history="1" r:id="rIdypo5-kbfmqerxhfql68qj">
         <w:r>
           <w:rPr>
             <w:rFonts w:ascii="Arial" w:cs="Arial" w:eastAsia="Arial" w:hAnsi="Arial"/>
@@ -21761,7 +24768,7 @@
       <w:pPr>
         <w:spacing w:after="120"/>
       </w:pPr>
-      <w:hyperlink w:history="1" r:id="rIdfskewjuzx8sy8jdlhgvye">
+      <w:hyperlink w:history="1" r:id="rId8gbcxpma7fjtfoxzmhiik">
         <w:r>
           <w:rPr>
             <w:rFonts w:ascii="Arial" w:cs="Arial" w:eastAsia="Arial" w:hAnsi="Arial"/>
@@ -21794,7 +24801,7 @@
       <w:pPr>
         <w:spacing w:after="120"/>
       </w:pPr>
-      <w:hyperlink w:history="1" r:id="rIdqzemwiiote9ohjqv_krsw">
+      <w:hyperlink w:history="1" r:id="rIdzc34xwwlcv9kpgfvama08">
         <w:r>
           <w:rPr>
             <w:rFonts w:ascii="Arial" w:cs="Arial" w:eastAsia="Arial" w:hAnsi="Arial"/>
@@ -21827,7 +24834,7 @@
       <w:pPr>
         <w:spacing w:after="120"/>
       </w:pPr>
-      <w:hyperlink w:history="1" r:id="rId0bye3xfpqwt-u4ag0b2h3">
+      <w:hyperlink w:history="1" r:id="rIdokoxnwce700hvlpe18ivf">
         <w:r>
           <w:rPr>
             <w:rFonts w:ascii="Arial" w:cs="Arial" w:eastAsia="Arial" w:hAnsi="Arial"/>
@@ -21860,7 +24867,7 @@
       <w:pPr>
         <w:spacing w:after="120"/>
       </w:pPr>
-      <w:hyperlink w:history="1" r:id="rId9nta4wjkhytuuzozdzfqz">
+      <w:hyperlink w:history="1" r:id="rId2t30fp_chdvseddkkffeh">
         <w:r>
           <w:rPr>
             <w:rFonts w:ascii="Arial" w:cs="Arial" w:eastAsia="Arial" w:hAnsi="Arial"/>
@@ -21881,7 +24888,7 @@
         </w:rPr>
         <w:t xml:space="preserve">  ·  </w:t>
       </w:r>
-      <w:hyperlink w:history="1" r:id="rIdu-shop7lq-jgth3uc_ghx">
+      <w:hyperlink w:history="1" r:id="rId_c-sb1dollszu4l9bciiu">
         <w:r>
           <w:rPr>
             <w:rFonts w:ascii="Arial" w:cs="Arial" w:eastAsia="Arial" w:hAnsi="Arial"/>
@@ -21902,7 +24909,7 @@
         </w:rPr>
         <w:t xml:space="preserve">  ·  </w:t>
       </w:r>
-      <w:hyperlink w:history="1" r:id="rIdqzcx9yxy6cdzb8shfnlnb">
+      <w:hyperlink w:history="1" r:id="rId1rmy7qadvrejc1cgl_e4g">
         <w:r>
           <w:rPr>
             <w:rFonts w:ascii="Arial" w:cs="Arial" w:eastAsia="Arial" w:hAnsi="Arial"/>
@@ -21935,7 +24942,7 @@
       <w:pPr>
         <w:spacing w:after="120"/>
       </w:pPr>
-      <w:hyperlink w:history="1" r:id="rIdxvfybkhi737cpqh_kxx7e">
+      <w:hyperlink w:history="1" r:id="rIdqdr3-xqtlwgznsqgfscwt">
         <w:r>
           <w:rPr>
             <w:rFonts w:ascii="Arial" w:cs="Arial" w:eastAsia="Arial" w:hAnsi="Arial"/>
@@ -21968,7 +24975,7 @@
       <w:pPr>
         <w:spacing w:after="120"/>
       </w:pPr>
-      <w:hyperlink w:history="1" r:id="rId-xyreln8sjdaiowiga6at">
+      <w:hyperlink w:history="1" r:id="rIdg_h748cf-7lztnhz-mlrj">
         <w:r>
           <w:rPr>
             <w:rFonts w:ascii="Arial" w:cs="Arial" w:eastAsia="Arial" w:hAnsi="Arial"/>
@@ -22001,7 +25008,7 @@
       <w:pPr>
         <w:spacing w:after="120"/>
       </w:pPr>
-      <w:hyperlink w:history="1" r:id="rIdxpkei468hzhn3uol8brmh">
+      <w:hyperlink w:history="1" r:id="rIdfzffnodd7qsqhuukm-8ht">
         <w:r>
           <w:rPr>
             <w:rFonts w:ascii="Arial" w:cs="Arial" w:eastAsia="Arial" w:hAnsi="Arial"/>
@@ -22034,7 +25041,7 @@
       <w:pPr>
         <w:spacing w:after="120"/>
       </w:pPr>
-      <w:hyperlink w:history="1" r:id="rIdeimkdzzyr0n8kmx2bgtin">
+      <w:hyperlink w:history="1" r:id="rIdz_aumkkws8z3f2gfdwvi5">
         <w:r>
           <w:rPr>
             <w:rFonts w:ascii="Arial" w:cs="Arial" w:eastAsia="Arial" w:hAnsi="Arial"/>
@@ -22067,7 +25074,7 @@
       <w:pPr>
         <w:spacing w:after="120"/>
       </w:pPr>
-      <w:hyperlink w:history="1" r:id="rId9ypvfruoztcspmk3fg0zs">
+      <w:hyperlink w:history="1" r:id="rIdhdkolcrhscdctxzvektny">
         <w:r>
           <w:rPr>
             <w:rFonts w:ascii="Arial" w:cs="Arial" w:eastAsia="Arial" w:hAnsi="Arial"/>
@@ -22100,7 +25107,7 @@
       <w:pPr>
         <w:spacing w:after="120"/>
       </w:pPr>
-      <w:hyperlink w:history="1" r:id="rIdc6loibjgjjt7vlsvb6aos">
+      <w:hyperlink w:history="1" r:id="rId-r1h_mac4s1ts0xx7whfv">
         <w:r>
           <w:rPr>
             <w:rFonts w:ascii="Arial" w:cs="Arial" w:eastAsia="Arial" w:hAnsi="Arial"/>
@@ -22121,7 +25128,7 @@
         </w:rPr>
         <w:t xml:space="preserve">  ·  </w:t>
       </w:r>
-      <w:hyperlink w:history="1" r:id="rIdbbeno_r8bsldter3x5c-w">
+      <w:hyperlink w:history="1" r:id="rIdnrmfqq-6y9afxpgvey5g8">
         <w:r>
           <w:rPr>
             <w:rFonts w:ascii="Arial" w:cs="Arial" w:eastAsia="Arial" w:hAnsi="Arial"/>
@@ -22154,7 +25161,7 @@
       <w:pPr>
         <w:spacing w:after="120"/>
       </w:pPr>
-      <w:hyperlink w:history="1" r:id="rIdohegggpuv4xc8xhxn3g4u">
+      <w:hyperlink w:history="1" r:id="rIdssnael6v45mjtnot61obo">
         <w:r>
           <w:rPr>
             <w:rFonts w:ascii="Arial" w:cs="Arial" w:eastAsia="Arial" w:hAnsi="Arial"/>
@@ -22187,7 +25194,7 @@
       <w:pPr>
         <w:spacing w:after="120"/>
       </w:pPr>
-      <w:hyperlink w:history="1" r:id="rIddce_e9te8fcttunt0py8t">
+      <w:hyperlink w:history="1" r:id="rIdofsggv9cptr-izdgzjmrn">
         <w:r>
           <w:rPr>
             <w:rFonts w:ascii="Arial" w:cs="Arial" w:eastAsia="Arial" w:hAnsi="Arial"/>
@@ -22220,7 +25227,7 @@
       <w:pPr>
         <w:spacing w:after="120"/>
       </w:pPr>
-      <w:hyperlink w:history="1" r:id="rIdwfefiar5oeo4jpsa6qiuc">
+      <w:hyperlink w:history="1" r:id="rIdhntp5jk0jczwalxq1rzvl">
         <w:r>
           <w:rPr>
             <w:rFonts w:ascii="Arial" w:cs="Arial" w:eastAsia="Arial" w:hAnsi="Arial"/>
@@ -22253,7 +25260,7 @@
       <w:pPr>
         <w:spacing w:after="120"/>
       </w:pPr>
-      <w:hyperlink w:history="1" r:id="rIdrao5apgscqw1ml3p11sdk">
+      <w:hyperlink w:history="1" r:id="rId6h522xopg8y0ogjoembn-">
         <w:r>
           <w:rPr>
             <w:rFonts w:ascii="Arial" w:cs="Arial" w:eastAsia="Arial" w:hAnsi="Arial"/>
@@ -22286,7 +25293,7 @@
       <w:pPr>
         <w:spacing w:after="120"/>
       </w:pPr>
-      <w:hyperlink w:history="1" r:id="rIdvltabq8tjkhf8ybpklige">
+      <w:hyperlink w:history="1" r:id="rIdcddpkdihj6y9_k8ryk0f9">
         <w:r>
           <w:rPr>
             <w:rFonts w:ascii="Arial" w:cs="Arial" w:eastAsia="Arial" w:hAnsi="Arial"/>

</xml_diff>